<commit_message>
Làm xong thí nghiệm 2
</commit_message>
<xml_diff>
--- a/Practice/Lab01/LAB01_M3.docx
+++ b/Practice/Lab01/LAB01_M3.docx
@@ -12419,20 +12419,7 @@
         <w:spacing w:after="60" w:line="276" w:lineRule="auto"/>
       </w:pPr>
       <w:r>
-        <w:rPr>
-          <w:b/>
-          <w:bCs/>
-          <w:sz w:val="22"/>
-          <w:szCs w:val="22"/>
-        </w:rPr>
-        <w:t>Bảng 8.</w:t>
-      </w:r>
-      <w:r>
-        <w:rPr>
-          <w:sz w:val="22"/>
-          <w:szCs w:val="22"/>
-        </w:rPr>
-        <w:t xml:space="preserve"> Đơn giá 6 bậc theo tham số a của Sinh viên</w:t>
+        <w:t>Bảng 8. Đơn giá 6 bậc theo tham số a của Sinh viên</w:t>
       </w:r>
     </w:p>
     <w:tbl>
@@ -12492,12 +12479,6 @@
               <w:jc w:val="center"/>
             </w:pPr>
             <w:r>
-              <w:rPr>
-                <w:b/>
-                <w:bCs/>
-                <w:sz w:val="22"/>
-                <w:szCs w:val="22"/>
-              </w:rPr>
               <w:t>Bậc</w:t>
             </w:r>
           </w:p>
@@ -12527,12 +12508,6 @@
               <w:jc w:val="center"/>
             </w:pPr>
             <w:r>
-              <w:rPr>
-                <w:b/>
-                <w:bCs/>
-                <w:sz w:val="22"/>
-                <w:szCs w:val="22"/>
-              </w:rPr>
               <w:t>1</w:t>
             </w:r>
           </w:p>
@@ -12562,12 +12537,6 @@
               <w:jc w:val="center"/>
             </w:pPr>
             <w:r>
-              <w:rPr>
-                <w:b/>
-                <w:bCs/>
-                <w:sz w:val="22"/>
-                <w:szCs w:val="22"/>
-              </w:rPr>
               <w:t>2</w:t>
             </w:r>
           </w:p>
@@ -12597,12 +12566,6 @@
               <w:jc w:val="center"/>
             </w:pPr>
             <w:r>
-              <w:rPr>
-                <w:b/>
-                <w:bCs/>
-                <w:sz w:val="22"/>
-                <w:szCs w:val="22"/>
-              </w:rPr>
               <w:t>3</w:t>
             </w:r>
           </w:p>
@@ -12632,12 +12595,6 @@
               <w:jc w:val="center"/>
             </w:pPr>
             <w:r>
-              <w:rPr>
-                <w:b/>
-                <w:bCs/>
-                <w:sz w:val="22"/>
-                <w:szCs w:val="22"/>
-              </w:rPr>
               <w:t>4</w:t>
             </w:r>
           </w:p>
@@ -12667,12 +12624,6 @@
               <w:jc w:val="center"/>
             </w:pPr>
             <w:r>
-              <w:rPr>
-                <w:b/>
-                <w:bCs/>
-                <w:sz w:val="22"/>
-                <w:szCs w:val="22"/>
-              </w:rPr>
               <w:t>5</w:t>
             </w:r>
           </w:p>
@@ -12702,12 +12653,6 @@
               <w:jc w:val="center"/>
             </w:pPr>
             <w:r>
-              <w:rPr>
-                <w:b/>
-                <w:bCs/>
-                <w:sz w:val="22"/>
-                <w:szCs w:val="22"/>
-              </w:rPr>
               <w:t>6</w:t>
             </w:r>
           </w:p>
@@ -12741,12 +12686,6 @@
               <w:jc w:val="center"/>
             </w:pPr>
             <w:r>
-              <w:rPr>
-                <w:b/>
-                <w:bCs/>
-                <w:sz w:val="22"/>
-                <w:szCs w:val="22"/>
-              </w:rPr>
               <w:t>Đơn giá</w:t>
             </w:r>
           </w:p>
@@ -12772,14 +12711,8 @@
           <w:p>
             <w:pPr>
               <w:spacing w:line="252" w:lineRule="auto"/>
-              <w:rPr>
-                <w:color w:val="FF0000"/>
-              </w:rPr>
-            </w:pPr>
-            <w:r>
-              <w:rPr>
-                <w:color w:val="FF0000"/>
-              </w:rPr>
+            </w:pPr>
+            <w:r>
               <w:t>1780</w:t>
             </w:r>
           </w:p>
@@ -12805,14 +12738,8 @@
           <w:p>
             <w:pPr>
               <w:spacing w:line="252" w:lineRule="auto"/>
-              <w:rPr>
-                <w:color w:val="FF0000"/>
-              </w:rPr>
-            </w:pPr>
-            <w:r>
-              <w:rPr>
-                <w:color w:val="FF0000"/>
-              </w:rPr>
+            </w:pPr>
+            <w:r>
               <w:t>1840</w:t>
             </w:r>
           </w:p>
@@ -12838,14 +12765,8 @@
           <w:p>
             <w:pPr>
               <w:spacing w:line="252" w:lineRule="auto"/>
-              <w:rPr>
-                <w:color w:val="FF0000"/>
-              </w:rPr>
-            </w:pPr>
-            <w:r>
-              <w:rPr>
-                <w:color w:val="FF0000"/>
-              </w:rPr>
+            </w:pPr>
+            <w:r>
               <w:t>2130</w:t>
             </w:r>
           </w:p>
@@ -12871,14 +12792,8 @@
           <w:p>
             <w:pPr>
               <w:spacing w:line="252" w:lineRule="auto"/>
-              <w:rPr>
-                <w:color w:val="FF0000"/>
-              </w:rPr>
-            </w:pPr>
-            <w:r>
-              <w:rPr>
-                <w:color w:val="FF0000"/>
-              </w:rPr>
+            </w:pPr>
+            <w:r>
               <w:t>2680</w:t>
             </w:r>
           </w:p>
@@ -12904,14 +12819,8 @@
           <w:p>
             <w:pPr>
               <w:spacing w:line="252" w:lineRule="auto"/>
-              <w:rPr>
-                <w:color w:val="FF0000"/>
-              </w:rPr>
-            </w:pPr>
-            <w:r>
-              <w:rPr>
-                <w:color w:val="FF0000"/>
-              </w:rPr>
+            </w:pPr>
+            <w:r>
               <w:t>3030</w:t>
             </w:r>
           </w:p>
@@ -12937,14 +12846,8 @@
           <w:p>
             <w:pPr>
               <w:spacing w:line="252" w:lineRule="auto"/>
-              <w:rPr>
-                <w:color w:val="FF0000"/>
-              </w:rPr>
-            </w:pPr>
-            <w:r>
-              <w:rPr>
-                <w:color w:val="FF0000"/>
-              </w:rPr>
+            </w:pPr>
+            <w:r>
               <w:t>3180</w:t>
             </w:r>
           </w:p>

</xml_diff>

<commit_message>
Hoàn thanh sơ bộ các thí nghiệm
</commit_message>
<xml_diff>
--- a/Practice/Lab01/LAB01_M3.docx
+++ b/Practice/Lab01/LAB01_M3.docx
@@ -12419,7 +12419,14 @@
         <w:spacing w:after="60" w:line="276" w:lineRule="auto"/>
       </w:pPr>
       <w:r>
-        <w:t>Bảng 8. Đơn giá 6 bậc theo tham số a của Sinh viên</w:t>
+        <w:rPr>
+          <w:b/>
+          <w:bCs/>
+        </w:rPr>
+        <w:t>Bảng 8.</w:t>
+      </w:r>
+      <w:r>
+        <w:t xml:space="preserve"> Đơn giá 6 bậc theo tham số a của Sinh viên</w:t>
       </w:r>
     </w:p>
     <w:tbl>
@@ -12983,11 +12990,9 @@
                 <w:sz w:val="20"/>
                 <w:szCs w:val="20"/>
               </w:rPr>
-              <w:t xml:space="preserve"> và các bậc ( các ngưỡng ) , đơn giá trong ,data</w:t>
-            </w:r>
-          </w:p>
-          <w:p>
-            <w:pPr>
+              <w:t xml:space="preserve"> và các bậc, đơn giá trong</w:t>
+            </w:r>
+            <w:r>
               <w:rPr>
                 <w:i/>
                 <w:iCs/>
@@ -12995,7 +13000,8 @@
                 <w:sz w:val="20"/>
                 <w:szCs w:val="20"/>
               </w:rPr>
-            </w:pPr>
+              <w:t xml:space="preserve"> </w:t>
+            </w:r>
             <w:r>
               <w:rPr>
                 <w:i/>
@@ -13004,9 +13010,11 @@
                 <w:sz w:val="20"/>
                 <w:szCs w:val="20"/>
               </w:rPr>
-              <w:t>Sau đó: đầu tiên cho nhập vào giá trị x ( số điện ) rồi kiểm tra điều kiện 0 &lt; x &lt; 9999 bằng phép so sánh và sẽ nhảy báo lỗi rồi bắt nhập lại .</w:t>
-            </w:r>
-            <w:r>
+              <w:t>,data</w:t>
+            </w:r>
+          </w:p>
+          <w:p>
+            <w:pPr>
               <w:rPr>
                 <w:i/>
                 <w:iCs/>
@@ -13014,11 +13022,8 @@
                 <w:sz w:val="20"/>
                 <w:szCs w:val="20"/>
               </w:rPr>
-              <w:t>Sau đó khởi tạo Sum_money và kWh_left để lưu tổng tiền và số kWh còn lại.</w:t>
-            </w:r>
-          </w:p>
-          <w:p>
-            <w:pPr>
+            </w:pPr>
+            <w:r>
               <w:rPr>
                 <w:i/>
                 <w:iCs/>
@@ -13026,7 +13031,8 @@
                 <w:sz w:val="20"/>
                 <w:szCs w:val="20"/>
               </w:rPr>
-            </w:pPr>
+              <w:t xml:space="preserve">Sau đó: đầu tiên cho nhập vào giá trị x ( </w:t>
+            </w:r>
             <w:r>
               <w:rPr>
                 <w:i/>
@@ -13035,11 +13041,9 @@
                 <w:sz w:val="20"/>
                 <w:szCs w:val="20"/>
               </w:rPr>
-              <w:t xml:space="preserve">Thuật toán vòng lặp : </w:t>
-            </w:r>
-          </w:p>
-          <w:p>
-            <w:pPr>
+              <w:t>kWh)</w:t>
+            </w:r>
+            <w:r>
               <w:rPr>
                 <w:i/>
                 <w:iCs/>
@@ -13047,7 +13051,8 @@
                 <w:sz w:val="20"/>
                 <w:szCs w:val="20"/>
               </w:rPr>
-            </w:pPr>
+              <w:t xml:space="preserve"> rồi kiểm tra điều kiện 0 &lt;</w:t>
+            </w:r>
             <w:r>
               <w:rPr>
                 <w:i/>
@@ -13056,11 +13061,9 @@
                 <w:sz w:val="20"/>
                 <w:szCs w:val="20"/>
               </w:rPr>
-              <w:t>+ Điều kiện kết thúc kWh_left &lt;= 0 ( Do đó chương trình không cần biết trước số bậc đã dùng)</w:t>
-            </w:r>
-          </w:p>
-          <w:p>
-            <w:pPr>
+              <w:t>=</w:t>
+            </w:r>
+            <w:r>
               <w:rPr>
                 <w:i/>
                 <w:iCs/>
@@ -13068,7 +13071,8 @@
                 <w:sz w:val="20"/>
                 <w:szCs w:val="20"/>
               </w:rPr>
-            </w:pPr>
+              <w:t xml:space="preserve"> x &lt;</w:t>
+            </w:r>
             <w:r>
               <w:rPr>
                 <w:i/>
@@ -13077,7 +13081,130 @@
                 <w:sz w:val="20"/>
                 <w:szCs w:val="20"/>
               </w:rPr>
-              <w:t>+ Cách xác đinh phần điện năng thuộc mỗi bậc : tại bậc hiện tại ta so sánh số kWh còn lại so với số kWh trong từng khung bậc . Nếu số kWh còn lại &gt;= dung lượng bậc thì ta sẽ tính là dung lượng bậc x đơn giá rồi lấy kWh còn lại trừ dung lượng bâc . Nếu số kWh_left &lt;= dung lượng bậc thì ta tính kWh_left x đơn giá , gán số kWh_left về 0 rồi thoát vòng lặp</w:t>
+              <w:t>=</w:t>
+            </w:r>
+            <w:r>
+              <w:rPr>
+                <w:i/>
+                <w:iCs/>
+                <w:color w:val="FF0000"/>
+                <w:sz w:val="20"/>
+                <w:szCs w:val="20"/>
+              </w:rPr>
+              <w:t xml:space="preserve"> 9999 bằng phép so sánh và sẽ nhảy báo lỗi rồi bắt nhập lại .</w:t>
+            </w:r>
+            <w:r>
+              <w:rPr>
+                <w:i/>
+                <w:iCs/>
+                <w:color w:val="FF0000"/>
+                <w:sz w:val="20"/>
+                <w:szCs w:val="20"/>
+              </w:rPr>
+              <w:t xml:space="preserve">Sau đó khởi tạo </w:t>
+            </w:r>
+            <w:r>
+              <w:rPr>
+                <w:i/>
+                <w:iCs/>
+                <w:color w:val="FF0000"/>
+                <w:sz w:val="20"/>
+                <w:szCs w:val="20"/>
+              </w:rPr>
+              <w:t>2 thanh ghi</w:t>
+            </w:r>
+            <w:r>
+              <w:rPr>
+                <w:i/>
+                <w:iCs/>
+                <w:color w:val="FF0000"/>
+                <w:sz w:val="20"/>
+                <w:szCs w:val="20"/>
+              </w:rPr>
+              <w:t xml:space="preserve"> để lưu tổng tiền và số kWh còn lại.</w:t>
+            </w:r>
+          </w:p>
+          <w:p>
+            <w:pPr>
+              <w:rPr>
+                <w:i/>
+                <w:iCs/>
+                <w:color w:val="FF0000"/>
+                <w:sz w:val="20"/>
+                <w:szCs w:val="20"/>
+              </w:rPr>
+            </w:pPr>
+            <w:r>
+              <w:rPr>
+                <w:i/>
+                <w:iCs/>
+                <w:color w:val="FF0000"/>
+                <w:sz w:val="20"/>
+                <w:szCs w:val="20"/>
+              </w:rPr>
+              <w:t xml:space="preserve">Thuật toán vòng lặp : </w:t>
+            </w:r>
+          </w:p>
+          <w:p>
+            <w:pPr>
+              <w:rPr>
+                <w:i/>
+                <w:iCs/>
+                <w:color w:val="FF0000"/>
+                <w:sz w:val="20"/>
+                <w:szCs w:val="20"/>
+              </w:rPr>
+            </w:pPr>
+            <w:r>
+              <w:rPr>
+                <w:i/>
+                <w:iCs/>
+                <w:color w:val="FF0000"/>
+                <w:sz w:val="20"/>
+                <w:szCs w:val="20"/>
+              </w:rPr>
+              <w:t>+ Điều kiện kết thúc kWh_left &lt;= 0 ( Do đó chương trình không cần biết trước số bậc đã dùng)</w:t>
+            </w:r>
+          </w:p>
+          <w:p>
+            <w:pPr>
+              <w:rPr>
+                <w:i/>
+                <w:iCs/>
+                <w:color w:val="FF0000"/>
+                <w:sz w:val="20"/>
+                <w:szCs w:val="20"/>
+              </w:rPr>
+            </w:pPr>
+            <w:r>
+              <w:rPr>
+                <w:i/>
+                <w:iCs/>
+                <w:color w:val="FF0000"/>
+                <w:sz w:val="20"/>
+                <w:szCs w:val="20"/>
+              </w:rPr>
+              <w:t xml:space="preserve">+ Cách xác đinh phần điện năng thuộc mỗi bậc : tại bậc hiện tại ta so sánh số kWh còn lại so với số kWh trong từng khung bậc . Nếu số kWh còn lại &gt;= dung lượng bậc thì ta sẽ tính là dung lượng bậc x đơn giá rồi lấy kWh còn lại trừ dung lượng bâc . Nếu số kWh_left &lt;= dung lượng bậc thì ta tính kWh_left </w:t>
+            </w:r>
+            <w:r>
+              <w:rPr>
+                <w:i/>
+                <w:iCs/>
+                <w:color w:val="FF0000"/>
+                <w:sz w:val="20"/>
+                <w:szCs w:val="20"/>
+              </w:rPr>
+              <w:t>*</w:t>
+            </w:r>
+            <w:r>
+              <w:rPr>
+                <w:i/>
+                <w:iCs/>
+                <w:color w:val="FF0000"/>
+                <w:sz w:val="20"/>
+                <w:szCs w:val="20"/>
+              </w:rPr>
+              <w:t xml:space="preserve"> đơn giá , gán số kWh_left về 0 rồi thoát vòng lặp</w:t>
             </w:r>
           </w:p>
           <w:p>
@@ -13614,7 +13741,19 @@
               <w:rPr>
                 <w:color w:val="FF0000"/>
               </w:rPr>
-              <w:t xml:space="preserve">Dùng để kiểm tra điều kiện </w:t>
+              <w:t>Dùng để kiểm tra điều kiện</w:t>
+            </w:r>
+            <w:r>
+              <w:rPr>
+                <w:color w:val="FF0000"/>
+              </w:rPr>
+              <w:t xml:space="preserve"> của x</w:t>
+            </w:r>
+            <w:r>
+              <w:rPr>
+                <w:color w:val="FF0000"/>
+              </w:rPr>
+              <w:t xml:space="preserve"> </w:t>
             </w:r>
           </w:p>
         </w:tc>
@@ -13681,6 +13820,12 @@
                 <w:color w:val="FF0000"/>
               </w:rPr>
             </w:pPr>
+            <w:r>
+              <w:rPr>
+                <w:color w:val="FF0000"/>
+              </w:rPr>
+              <w:t>Lưu giá trị của dung lượng tại bậc hiện tại</w:t>
+            </w:r>
           </w:p>
         </w:tc>
       </w:tr>
@@ -13746,6 +13891,24 @@
                 <w:color w:val="FF0000"/>
               </w:rPr>
             </w:pPr>
+            <w:r>
+              <w:rPr>
+                <w:color w:val="FF0000"/>
+              </w:rPr>
+              <w:t xml:space="preserve">Lưu giá trị của </w:t>
+            </w:r>
+            <w:r>
+              <w:rPr>
+                <w:color w:val="FF0000"/>
+              </w:rPr>
+              <w:t>giá tiền</w:t>
+            </w:r>
+            <w:r>
+              <w:rPr>
+                <w:color w:val="FF0000"/>
+              </w:rPr>
+              <w:t xml:space="preserve"> tại bậc hiện tại</w:t>
+            </w:r>
           </w:p>
         </w:tc>
       </w:tr>
@@ -13811,6 +13974,12 @@
                 <w:color w:val="FF0000"/>
               </w:rPr>
             </w:pPr>
+            <w:r>
+              <w:rPr>
+                <w:color w:val="FF0000"/>
+              </w:rPr>
+              <w:t>Lưu giá trị (tiền điện * dung lượng) hoạc (số kWh còn lại * giá tiền) tại bậc hiện tại</w:t>
+            </w:r>
           </w:p>
         </w:tc>
       </w:tr>
@@ -13876,6 +14045,12 @@
                 <w:color w:val="FF0000"/>
               </w:rPr>
             </w:pPr>
+            <w:r>
+              <w:rPr>
+                <w:color w:val="FF0000"/>
+              </w:rPr>
+              <w:t xml:space="preserve">Số kWh còn lại </w:t>
+            </w:r>
           </w:p>
         </w:tc>
       </w:tr>
@@ -14433,6 +14608,12 @@
                 <w:color w:val="FF0000"/>
               </w:rPr>
             </w:pPr>
+            <w:r>
+              <w:rPr>
+                <w:color w:val="FF0000"/>
+              </w:rPr>
+              <w:t>Khớp</w:t>
+            </w:r>
           </w:p>
         </w:tc>
       </w:tr>
@@ -14567,6 +14748,12 @@
                 <w:color w:val="FF0000"/>
               </w:rPr>
             </w:pPr>
+            <w:r>
+              <w:rPr>
+                <w:color w:val="FF0000"/>
+              </w:rPr>
+              <w:t>Khớp</w:t>
+            </w:r>
           </w:p>
         </w:tc>
       </w:tr>
@@ -14701,6 +14888,12 @@
                 <w:color w:val="FF0000"/>
               </w:rPr>
             </w:pPr>
+            <w:r>
+              <w:rPr>
+                <w:color w:val="FF0000"/>
+              </w:rPr>
+              <w:t>Khớp</w:t>
+            </w:r>
           </w:p>
         </w:tc>
       </w:tr>
@@ -14835,6 +15028,12 @@
                 <w:color w:val="FF0000"/>
               </w:rPr>
             </w:pPr>
+            <w:r>
+              <w:rPr>
+                <w:color w:val="FF0000"/>
+              </w:rPr>
+              <w:t>Khớp</w:t>
+            </w:r>
           </w:p>
         </w:tc>
       </w:tr>
@@ -14969,6 +15168,12 @@
                 <w:color w:val="FF0000"/>
               </w:rPr>
             </w:pPr>
+            <w:r>
+              <w:rPr>
+                <w:color w:val="FF0000"/>
+              </w:rPr>
+              <w:t>Khớp</w:t>
+            </w:r>
           </w:p>
         </w:tc>
       </w:tr>
@@ -15099,6 +15304,12 @@
                 <w:color w:val="FF0000"/>
               </w:rPr>
             </w:pPr>
+            <w:r>
+              <w:rPr>
+                <w:color w:val="FF0000"/>
+              </w:rPr>
+              <w:t>Khớp</w:t>
+            </w:r>
           </w:p>
         </w:tc>
       </w:tr>
@@ -15327,6 +15538,12 @@
                 <w:color w:val="FF0000"/>
               </w:rPr>
             </w:pPr>
+            <w:r>
+              <w:rPr>
+                <w:color w:val="FF0000"/>
+              </w:rPr>
+              <w:t>In : Tien dien: 0 dong</w:t>
+            </w:r>
           </w:p>
         </w:tc>
         <w:tc>
@@ -15355,6 +15572,12 @@
                 <w:color w:val="FF0000"/>
               </w:rPr>
             </w:pPr>
+            <w:r>
+              <w:rPr>
+                <w:color w:val="FF0000"/>
+              </w:rPr>
+              <w:t>Tien dien: 0 dong</w:t>
+            </w:r>
           </w:p>
         </w:tc>
       </w:tr>
@@ -15421,6 +15644,12 @@
                 <w:color w:val="FF0000"/>
               </w:rPr>
             </w:pPr>
+            <w:r>
+              <w:rPr>
+                <w:color w:val="FF0000"/>
+              </w:rPr>
+              <w:t xml:space="preserve">In ra số tiền điện </w:t>
+            </w:r>
           </w:p>
         </w:tc>
         <w:tc>
@@ -15449,6 +15678,12 @@
                 <w:color w:val="FF0000"/>
               </w:rPr>
             </w:pPr>
+            <w:r>
+              <w:rPr>
+                <w:color w:val="FF0000"/>
+              </w:rPr>
+              <w:t>Tien dien: 31489820 dong</w:t>
+            </w:r>
           </w:p>
         </w:tc>
       </w:tr>
@@ -15515,6 +15750,12 @@
                 <w:color w:val="FF0000"/>
               </w:rPr>
             </w:pPr>
+            <w:r>
+              <w:rPr>
+                <w:color w:val="FF0000"/>
+              </w:rPr>
+              <w:t xml:space="preserve">Báo lỗi và bắt nhập lại </w:t>
+            </w:r>
           </w:p>
         </w:tc>
         <w:tc>
@@ -15543,6 +15784,12 @@
                 <w:color w:val="FF0000"/>
               </w:rPr>
             </w:pPr>
+            <w:r>
+              <w:rPr>
+                <w:color w:val="FF0000"/>
+              </w:rPr>
+              <w:t>Gia tri khong hop le, nhap lai.</w:t>
+            </w:r>
           </w:p>
         </w:tc>
       </w:tr>
@@ -15607,6 +15854,12 @@
                 <w:color w:val="FF0000"/>
               </w:rPr>
             </w:pPr>
+            <w:r>
+              <w:rPr>
+                <w:color w:val="FF0000"/>
+              </w:rPr>
+              <w:t xml:space="preserve">Báo lỗi và bắt nhập lại </w:t>
+            </w:r>
           </w:p>
         </w:tc>
         <w:tc>
@@ -15634,6 +15887,12 @@
                 <w:color w:val="FF0000"/>
               </w:rPr>
             </w:pPr>
+            <w:r>
+              <w:rPr>
+                <w:color w:val="FF0000"/>
+              </w:rPr>
+              <w:t>Gia tri khong hop le, nhap lai.</w:t>
+            </w:r>
           </w:p>
         </w:tc>
       </w:tr>
@@ -15713,11 +15972,6 @@
             </w:tcMar>
           </w:tcPr>
           <w:p>
-            <w:pPr>
-              <w:rPr>
-                <w:color w:val="FF0000"/>
-              </w:rPr>
-            </w:pPr>
             <w:r>
               <w:rPr>
                 <w:i/>
@@ -15727,6 +15981,76 @@
                 <w:szCs w:val="20"/>
               </w:rPr>
               <w:t>Trả lời:</w:t>
+            </w:r>
+            <w:r>
+              <w:rPr>
+                <w:i/>
+                <w:iCs/>
+                <w:color w:val="FF0000"/>
+                <w:sz w:val="20"/>
+                <w:szCs w:val="20"/>
+              </w:rPr>
+              <w:t xml:space="preserve"> Trong chương trình em sử dụng một lệnh so sánh là </w:t>
+            </w:r>
+            <w:r>
+              <w:rPr>
+                <w:i/>
+                <w:iCs/>
+                <w:color w:val="FF0000"/>
+                <w:sz w:val="20"/>
+                <w:szCs w:val="20"/>
+              </w:rPr>
+              <w:t>sltiu $t0, $s0, 10000</w:t>
+            </w:r>
+            <w:r>
+              <w:rPr>
+                <w:i/>
+                <w:iCs/>
+                <w:color w:val="FF0000"/>
+                <w:sz w:val="20"/>
+                <w:szCs w:val="20"/>
+              </w:rPr>
+              <w:t xml:space="preserve"> nghĩa là nếu giá trị tại thanh ghi s0 nhỏ hơn 10000 ( tức là x &lt;=9999) thì  thanh ghi $t0 = 1 , nếu nhập x &lt;0 tức là số âm thì </w:t>
+            </w:r>
+            <w:r>
+              <w:rPr>
+                <w:i/>
+                <w:iCs/>
+                <w:color w:val="FF0000"/>
+                <w:sz w:val="20"/>
+                <w:szCs w:val="20"/>
+              </w:rPr>
+              <w:t>giá trị biểu diễn bù 2 sẽ chuyển thành số không dấu rất lớn</w:t>
+            </w:r>
+            <w:r>
+              <w:rPr>
+                <w:i/>
+                <w:iCs/>
+                <w:color w:val="FF0000"/>
+                <w:sz w:val="20"/>
+                <w:szCs w:val="20"/>
+              </w:rPr>
+              <w:t xml:space="preserve"> . Sau đó em dùng lệnh </w:t>
+            </w:r>
+            <w:r>
+              <w:rPr>
+                <w:i/>
+                <w:iCs/>
+                <w:color w:val="FF0000"/>
+                <w:sz w:val="20"/>
+                <w:szCs w:val="20"/>
+              </w:rPr>
+              <w:t xml:space="preserve">  beq   $t0, $zero, wronginput</w:t>
+            </w:r>
+            <w:r>
+              <w:rPr>
+                <w:i/>
+                <w:iCs/>
+                <w:color w:val="FF0000"/>
+                <w:sz w:val="20"/>
+                <w:szCs w:val="20"/>
+              </w:rPr>
+              <w:t xml:space="preserve"> để so sánh xem t0 = 0 ? hay không , nếu = 0 tức là điều kiện sai và sẽ nhảy tới nhánh wronginput để nhập lại</w:t>
             </w:r>
           </w:p>
         </w:tc>
@@ -15916,6 +16240,27 @@
                 <w:color w:val="FF0000"/>
               </w:rPr>
             </w:pPr>
+            <w:r>
+              <w:rPr>
+                <w:color w:val="FF0000"/>
+              </w:rPr>
+              <w:t xml:space="preserve">Chương trình hiểu </w:t>
+            </w:r>
+            <m:oMath>
+              <m:r>
+                <w:rPr>
+                  <w:rFonts w:ascii="Cambria Math" w:hAnsi="Cambria Math"/>
+                  <w:color w:val="FF0000"/>
+                </w:rPr>
+                <m:t>-1&lt;10000</m:t>
+              </m:r>
+            </m:oMath>
+            <w:r>
+              <w:rPr>
+                <w:color w:val="FF0000"/>
+              </w:rPr>
+              <w:t xml:space="preserve"> là đúng, không báo lỗi mà chuyển sang tính toán và in kết quả</w:t>
+            </w:r>
           </w:p>
         </w:tc>
         <w:tc>
@@ -15943,6 +16288,12 @@
                 <w:color w:val="FF0000"/>
               </w:rPr>
             </w:pPr>
+            <w:r>
+              <w:rPr>
+                <w:color w:val="FF0000"/>
+              </w:rPr>
+              <w:t>Tien dien: 0 dong</w:t>
+            </w:r>
           </w:p>
         </w:tc>
       </w:tr>
@@ -16027,6 +16378,16 @@
                 <w:szCs w:val="20"/>
               </w:rPr>
               <w:t>Trả lời:</w:t>
+            </w:r>
+            <w:r>
+              <w:rPr>
+                <w:i/>
+                <w:iCs/>
+                <w:color w:val="FF0000"/>
+                <w:sz w:val="20"/>
+                <w:szCs w:val="20"/>
+              </w:rPr>
+              <w:t>số -1 trong máy được biểu diễn dưới dạng một chuỗi bit 1 , Nên khi dùng lệnh slti máy sẽ thấy bit MSB = 1 tức là số này đang âm nên mặc định -1 &lt; 10000 là đúng còn khi dùng sltiu ( so sánh không dấu ) thì MSB=1 tức là số này hiện tại rất lớn và lớn hơn 10000 nên nó nhận diện được lỗi và yêu cầu nhập lại</w:t>
             </w:r>
           </w:p>
         </w:tc>
@@ -16322,6 +16683,12 @@
                 <w:color w:val="FF0000"/>
               </w:rPr>
             </w:pPr>
+            <w:r>
+              <w:rPr>
+                <w:color w:val="FF0000"/>
+              </w:rPr>
+              <w:t>0x10010070</w:t>
+            </w:r>
           </w:p>
         </w:tc>
         <w:tc>
@@ -16349,6 +16716,12 @@
                 <w:color w:val="FF0000"/>
               </w:rPr>
             </w:pPr>
+            <w:r>
+              <w:rPr>
+                <w:color w:val="FF0000"/>
+              </w:rPr>
+              <w:t>0x10010078</w:t>
+            </w:r>
           </w:p>
         </w:tc>
         <w:tc>
@@ -16376,6 +16749,12 @@
                 <w:color w:val="FF0000"/>
               </w:rPr>
             </w:pPr>
+            <w:r>
+              <w:rPr>
+                <w:color w:val="FF0000"/>
+              </w:rPr>
+              <w:t>0x00000852</w:t>
+            </w:r>
           </w:p>
         </w:tc>
         <w:tc>
@@ -16403,6 +16782,12 @@
                 <w:color w:val="FF0000"/>
               </w:rPr>
             </w:pPr>
+            <w:r>
+              <w:rPr>
+                <w:color w:val="FF0000"/>
+              </w:rPr>
+              <w:t>2130</w:t>
+            </w:r>
           </w:p>
         </w:tc>
       </w:tr>
@@ -16474,18 +16859,260 @@
           <w:p>
             <w:pPr>
               <w:rPr>
-                <w:color w:val="FF0000"/>
-              </w:rPr>
-            </w:pPr>
-            <w:r>
-              <w:rPr>
                 <w:i/>
                 <w:iCs/>
                 <w:color w:val="FF0000"/>
                 <w:sz w:val="20"/>
                 <w:szCs w:val="20"/>
               </w:rPr>
+            </w:pPr>
+            <w:r>
+              <w:rPr>
+                <w:i/>
+                <w:iCs/>
+                <w:color w:val="FF0000"/>
+                <w:sz w:val="20"/>
+                <w:szCs w:val="20"/>
+              </w:rPr>
               <w:t>Trả lời:</w:t>
+            </w:r>
+            <w:r>
+              <w:rPr>
+                <w:i/>
+                <w:iCs/>
+                <w:color w:val="FF0000"/>
+                <w:sz w:val="20"/>
+                <w:szCs w:val="20"/>
+              </w:rPr>
+              <w:t>Tổng tiền lớn nhất với miền hợp lệ là x = 9999 , tổng tiền 31489820 dong . Phép cộng không có khả năng gây tràn số 32 bit vì g</w:t>
+            </w:r>
+            <w:r>
+              <w:rPr>
+                <w:i/>
+                <w:iCs/>
+                <w:color w:val="FF0000"/>
+                <w:sz w:val="20"/>
+                <w:szCs w:val="20"/>
+              </w:rPr>
+              <w:t xml:space="preserve">iới hạn của số nguyên có dấu 32-bit là </w:t>
+            </w:r>
+            <m:oMath>
+              <m:sSup>
+                <m:sSupPr>
+                  <m:ctrlPr>
+                    <w:rPr>
+                      <w:rFonts w:ascii="Cambria Math" w:hAnsi="Cambria Math"/>
+                      <w:i/>
+                      <w:iCs/>
+                      <w:color w:val="FF0000"/>
+                      <w:sz w:val="20"/>
+                      <w:szCs w:val="20"/>
+                    </w:rPr>
+                  </m:ctrlPr>
+                </m:sSupPr>
+                <m:e>
+                  <m:r>
+                    <w:rPr>
+                      <w:rFonts w:ascii="Cambria Math" w:hAnsi="Cambria Math"/>
+                      <w:color w:val="FF0000"/>
+                      <w:sz w:val="20"/>
+                      <w:szCs w:val="20"/>
+                    </w:rPr>
+                    <m:t>2</m:t>
+                  </m:r>
+                </m:e>
+                <m:sup>
+                  <m:r>
+                    <w:rPr>
+                      <w:rFonts w:ascii="Cambria Math" w:hAnsi="Cambria Math"/>
+                      <w:color w:val="FF0000"/>
+                      <w:sz w:val="20"/>
+                      <w:szCs w:val="20"/>
+                    </w:rPr>
+                    <m:t>31</m:t>
+                  </m:r>
+                </m:sup>
+              </m:sSup>
+              <m:r>
+                <w:rPr>
+                  <w:rFonts w:ascii="Cambria Math" w:hAnsi="Cambria Math"/>
+                  <w:color w:val="FF0000"/>
+                  <w:sz w:val="20"/>
+                  <w:szCs w:val="20"/>
+                </w:rPr>
+                <m:t>-1=2,147,483,647</m:t>
+              </m:r>
+            </m:oMath>
+            <w:r>
+              <w:rPr>
+                <w:i/>
+                <w:iCs/>
+                <w:color w:val="FF0000"/>
+                <w:sz w:val="20"/>
+                <w:szCs w:val="20"/>
+              </w:rPr>
+              <w:t xml:space="preserve"> đồng.</w:t>
+            </w:r>
+          </w:p>
+          <w:p>
+            <w:pPr>
+              <w:rPr>
+                <w:i/>
+                <w:iCs/>
+                <w:color w:val="FF0000"/>
+                <w:sz w:val="20"/>
+                <w:szCs w:val="20"/>
+              </w:rPr>
+            </w:pPr>
+            <w:r>
+              <w:rPr>
+                <w:i/>
+                <w:iCs/>
+                <w:color w:val="FF0000"/>
+                <w:sz w:val="20"/>
+                <w:szCs w:val="20"/>
+              </w:rPr>
+              <w:t>Giới hạn N lớn nhất:</w:t>
+            </w:r>
+            <w:r>
+              <w:rPr>
+                <w:i/>
+                <w:iCs/>
+                <w:color w:val="FF0000"/>
+                <w:sz w:val="20"/>
+                <w:szCs w:val="20"/>
+              </w:rPr>
+              <w:t xml:space="preserve"> </w:t>
+            </w:r>
+            <w:r>
+              <w:rPr>
+                <w:i/>
+                <w:iCs/>
+                <w:color w:val="FF0000"/>
+                <w:sz w:val="20"/>
+                <w:szCs w:val="20"/>
+              </w:rPr>
+              <w:t xml:space="preserve">965,000 + (N - 400) </w:t>
+            </w:r>
+            <w:r>
+              <w:rPr>
+                <w:i/>
+                <w:iCs/>
+                <w:color w:val="FF0000"/>
+                <w:sz w:val="20"/>
+                <w:szCs w:val="20"/>
+              </w:rPr>
+              <w:t>*</w:t>
+            </w:r>
+            <w:r>
+              <w:rPr>
+                <w:i/>
+                <w:iCs/>
+                <w:color w:val="FF0000"/>
+                <w:sz w:val="20"/>
+                <w:szCs w:val="20"/>
+              </w:rPr>
+              <w:t xml:space="preserve">3180 </w:t>
+            </w:r>
+            <w:r>
+              <w:rPr>
+                <w:i/>
+                <w:iCs/>
+                <w:color w:val="FF0000"/>
+                <w:sz w:val="20"/>
+                <w:szCs w:val="20"/>
+              </w:rPr>
+              <w:t>&lt;=</w:t>
+            </w:r>
+            <w:r>
+              <w:rPr>
+                <w:i/>
+                <w:iCs/>
+                <w:color w:val="FF0000"/>
+                <w:sz w:val="20"/>
+                <w:szCs w:val="20"/>
+              </w:rPr>
+              <w:t>2,147,483,64</w:t>
+            </w:r>
+            <w:r>
+              <w:rPr>
+                <w:i/>
+                <w:iCs/>
+                <w:color w:val="FF0000"/>
+                <w:sz w:val="20"/>
+                <w:szCs w:val="20"/>
+              </w:rPr>
+              <w:t>7</w:t>
+            </w:r>
+          </w:p>
+          <w:p>
+            <w:pPr>
+              <w:pStyle w:val="ListParagraph"/>
+              <w:numPr>
+                <w:ilvl w:val="0"/>
+                <w:numId w:val="5"/>
+              </w:numPr>
+              <w:rPr>
+                <w:color w:val="FF0000"/>
+              </w:rPr>
+            </w:pPr>
+            <w:r>
+              <w:rPr>
+                <w:i/>
+                <w:iCs/>
+                <w:color w:val="FF0000"/>
+                <w:sz w:val="20"/>
+                <w:szCs w:val="20"/>
+              </w:rPr>
+              <w:t>N =</w:t>
+            </w:r>
+            <m:oMath>
+              <m:r>
+                <w:rPr>
+                  <w:rFonts w:ascii="Cambria Math" w:hAnsi="Cambria Math"/>
+                  <w:color w:val="FF0000"/>
+                  <w:sz w:val="20"/>
+                  <w:szCs w:val="20"/>
+                </w:rPr>
+                <m:t>675,405</m:t>
+              </m:r>
+              <m:r>
+                <m:rPr>
+                  <m:nor/>
+                </m:rPr>
+                <w:rPr>
+                  <w:i/>
+                  <w:iCs/>
+                  <w:color w:val="FF0000"/>
+                  <w:sz w:val="20"/>
+                  <w:szCs w:val="20"/>
+                </w:rPr>
+                <m:t> kWh</m:t>
+              </m:r>
+            </m:oMath>
+            <w:r>
+              <w:rPr>
+                <w:i/>
+                <w:iCs/>
+                <w:color w:val="FF0000"/>
+                <w:sz w:val="20"/>
+                <w:szCs w:val="20"/>
+              </w:rPr>
+              <w:t xml:space="preserve"> ( xấp xỉ)</w:t>
+            </w:r>
+            <w:r>
+              <w:rPr>
+                <w:color w:val="FF0000"/>
+                <w:sz w:val="20"/>
+                <w:szCs w:val="20"/>
+              </w:rPr>
+              <w:t xml:space="preserve"> </w:t>
+            </w:r>
+            <w:r>
+              <w:rPr>
+                <w:color w:val="FF0000"/>
+              </w:rPr>
+              <w:br/>
             </w:r>
           </w:p>
         </w:tc>
@@ -16569,7 +17196,8 @@
           <w:p>
             <w:pPr>
               <w:rPr>
-                <w:color w:val="FF0000"/>
+                <w:sz w:val="20"/>
+                <w:szCs w:val="20"/>
               </w:rPr>
             </w:pPr>
             <w:r>
@@ -16581,6 +17209,171 @@
                 <w:szCs w:val="20"/>
               </w:rPr>
               <w:t>Trả lời:</w:t>
+            </w:r>
+            <w:r>
+              <w:rPr>
+                <w:sz w:val="20"/>
+                <w:szCs w:val="20"/>
+              </w:rPr>
+              <w:t xml:space="preserve"> </w:t>
+            </w:r>
+          </w:p>
+          <w:p>
+            <w:pPr>
+              <w:rPr>
+                <w:i/>
+                <w:iCs/>
+                <w:color w:val="FF0000"/>
+                <w:sz w:val="20"/>
+                <w:szCs w:val="20"/>
+              </w:rPr>
+            </w:pPr>
+            <w:r>
+              <w:rPr>
+                <w:i/>
+                <w:iCs/>
+                <w:color w:val="FF0000"/>
+                <w:sz w:val="20"/>
+                <w:szCs w:val="20"/>
+              </w:rPr>
+              <w:t xml:space="preserve">Tiêu chí 1: Kích thước mã </w:t>
+            </w:r>
+            <w:r>
+              <w:rPr>
+                <w:i/>
+                <w:iCs/>
+                <w:color w:val="FF0000"/>
+                <w:sz w:val="20"/>
+                <w:szCs w:val="20"/>
+              </w:rPr>
+              <w:t xml:space="preserve">: </w:t>
+            </w:r>
+            <w:r>
+              <w:rPr>
+                <w:i/>
+                <w:iCs/>
+                <w:color w:val="FF0000"/>
+                <w:sz w:val="20"/>
+                <w:szCs w:val="20"/>
+              </w:rPr>
+              <w:t xml:space="preserve">sử dụng một vòng lặp duy nhất </w:t>
+            </w:r>
+            <w:r>
+              <w:rPr>
+                <w:i/>
+                <w:iCs/>
+                <w:color w:val="FF0000"/>
+                <w:sz w:val="20"/>
+                <w:szCs w:val="20"/>
+              </w:rPr>
+              <w:t>thì tốn khoảng độ 10 vòng lệnh máy</w:t>
+            </w:r>
+            <w:r>
+              <w:rPr>
+                <w:i/>
+                <w:iCs/>
+                <w:color w:val="FF0000"/>
+                <w:sz w:val="20"/>
+                <w:szCs w:val="20"/>
+              </w:rPr>
+              <w:t xml:space="preserve">. </w:t>
+            </w:r>
+            <w:r>
+              <w:rPr>
+                <w:i/>
+                <w:iCs/>
+                <w:color w:val="FF0000"/>
+                <w:sz w:val="20"/>
+                <w:szCs w:val="20"/>
+              </w:rPr>
+              <w:t>Còn n</w:t>
+            </w:r>
+            <w:r>
+              <w:rPr>
+                <w:i/>
+                <w:iCs/>
+                <w:color w:val="FF0000"/>
+                <w:sz w:val="20"/>
+                <w:szCs w:val="20"/>
+              </w:rPr>
+              <w:t xml:space="preserve">ếu viết 6 nhánh if riêng biệt, </w:t>
+            </w:r>
+            <w:r>
+              <w:rPr>
+                <w:i/>
+                <w:iCs/>
+                <w:color w:val="FF0000"/>
+                <w:sz w:val="20"/>
+                <w:szCs w:val="20"/>
+              </w:rPr>
+              <w:t xml:space="preserve">kích thước sẽ tăng rất nhiều do phải lặp lại các cấu trúc </w:t>
+            </w:r>
+            <w:r>
+              <w:rPr>
+                <w:i/>
+                <w:iCs/>
+                <w:color w:val="FF0000"/>
+                <w:sz w:val="20"/>
+                <w:szCs w:val="20"/>
+              </w:rPr>
+              <w:t>so sánh, nhân, cộng và rẽ nhánh 6 lần.</w:t>
+            </w:r>
+          </w:p>
+          <w:p>
+            <w:pPr>
+              <w:rPr>
+                <w:color w:val="FF0000"/>
+              </w:rPr>
+            </w:pPr>
+            <w:r>
+              <w:rPr>
+                <w:i/>
+                <w:iCs/>
+                <w:color w:val="FF0000"/>
+                <w:sz w:val="20"/>
+                <w:szCs w:val="20"/>
+              </w:rPr>
+              <w:t>Tiêu chí 2: Khả năng mở rộng và bảo trì:</w:t>
+            </w:r>
+            <w:r>
+              <w:rPr>
+                <w:i/>
+                <w:iCs/>
+                <w:color w:val="FF0000"/>
+                <w:sz w:val="20"/>
+                <w:szCs w:val="20"/>
+              </w:rPr>
+              <w:t xml:space="preserve"> </w:t>
+            </w:r>
+            <w:r>
+              <w:rPr>
+                <w:i/>
+                <w:iCs/>
+                <w:color w:val="FF0000"/>
+                <w:sz w:val="20"/>
+                <w:szCs w:val="20"/>
+              </w:rPr>
+              <w:t>Khi biểu giá điện thay đổi hoặc bổ sung thêm nhiều bậc mới (ví dụ từ 6 bậc lên 10 bậc), phương án duyệt mảng chỉ cần cập nhật dữ liệu trong mảng .data mà không cần chỉnh sửa hay biên dịch lại bất kỳ lệnh nào trong đoạn mã thực thi (.text).   Với cách viết 6 nhánh if</w:t>
+            </w:r>
+            <w:r>
+              <w:rPr>
+                <w:i/>
+                <w:iCs/>
+                <w:color w:val="FF0000"/>
+                <w:sz w:val="20"/>
+                <w:szCs w:val="20"/>
+              </w:rPr>
+              <w:t xml:space="preserve"> thì</w:t>
+            </w:r>
+            <w:r>
+              <w:rPr>
+                <w:i/>
+                <w:iCs/>
+                <w:color w:val="FF0000"/>
+                <w:sz w:val="20"/>
+                <w:szCs w:val="20"/>
+              </w:rPr>
+              <w:t xml:space="preserve"> buộc phải can thiệp cấu trúc mã máy, sửa đổi các nhãn rẽ nhánh và kiểm thử lại toàn bộ luồng điều khiển.</w:t>
             </w:r>
           </w:p>
         </w:tc>
@@ -16615,7 +17408,7 @@
       <w:tr>
         <w:trPr>
           <w:cantSplit/>
-          <w:trHeight w:val="2200"/>
+          <w:trHeight w:val="3943"/>
         </w:trPr>
         <w:tc>
           <w:tcPr>
@@ -16637,8 +17430,6 @@
           <w:p>
             <w:pPr>
               <w:jc w:val="center"/>
-            </w:pPr>
-            <w:r>
               <w:rPr>
                 <w:i/>
                 <w:iCs/>
@@ -16646,7 +17437,64 @@
                 <w:sz w:val="20"/>
                 <w:szCs w:val="20"/>
               </w:rPr>
-              <w:t>Dán ảnh chụp Run I/O với x = x_b của Sinh viên (thấy lời nhắc, giá trị nhập và dòng kết quả)</w:t>
+            </w:pPr>
+          </w:p>
+          <w:p>
+            <w:pPr>
+              <w:jc w:val="center"/>
+            </w:pPr>
+            <w:r>
+              <w:rPr>
+                <w:i/>
+                <w:iCs/>
+                <w:color w:val="7F7F7F"/>
+                <w:sz w:val="20"/>
+                <w:szCs w:val="20"/>
+              </w:rPr>
+              <w:drawing>
+                <wp:inline distT="0" distB="0" distL="0" distR="0" wp14:anchorId="4E6FAA4B" wp14:editId="077AA2C9">
+                  <wp:extent cx="5974596" cy="2384473"/>
+                  <wp:effectExtent l="0" t="0" r="7620" b="5715"/>
+                  <wp:docPr id="1618642091" name="Picture 1"/>
+                  <wp:cNvGraphicFramePr>
+                    <a:graphicFrameLocks xmlns:a="http://schemas.openxmlformats.org/drawingml/2006/main" noChangeAspect="1"/>
+                  </wp:cNvGraphicFramePr>
+                  <a:graphic xmlns:a="http://schemas.openxmlformats.org/drawingml/2006/main">
+                    <a:graphicData uri="http://schemas.openxmlformats.org/drawingml/2006/picture">
+                      <pic:pic xmlns:pic="http://schemas.openxmlformats.org/drawingml/2006/picture">
+                        <pic:nvPicPr>
+                          <pic:cNvPr id="1618642091" name=""/>
+                          <pic:cNvPicPr/>
+                        </pic:nvPicPr>
+                        <pic:blipFill rotWithShape="1">
+                          <a:blip r:embed="rId9"/>
+                          <a:srcRect b="35087"/>
+                          <a:stretch>
+                            <a:fillRect/>
+                          </a:stretch>
+                        </pic:blipFill>
+                        <pic:spPr bwMode="auto">
+                          <a:xfrm>
+                            <a:off x="0" y="0"/>
+                            <a:ext cx="5974596" cy="2384473"/>
+                          </a:xfrm>
+                          <a:prstGeom prst="rect">
+                            <a:avLst/>
+                          </a:prstGeom>
+                          <a:ln>
+                            <a:noFill/>
+                          </a:ln>
+                          <a:extLst>
+                            <a:ext uri="{53640926-AAD7-44D8-BBD7-CCE9431645EC}">
+                              <a14:shadowObscured xmlns:a14="http://schemas.microsoft.com/office/drawing/2010/main"/>
+                            </a:ext>
+                          </a:extLst>
+                        </pic:spPr>
+                      </pic:pic>
+                    </a:graphicData>
+                  </a:graphic>
+                </wp:inline>
+              </w:drawing>
             </w:r>
           </w:p>
         </w:tc>
@@ -19675,6 +20523,12 @@
                 <w:color w:val="FF0000"/>
               </w:rPr>
             </w:pPr>
+            <w:r>
+              <w:rPr>
+                <w:color w:val="FF0000"/>
+              </w:rPr>
+              <w:t>6400</w:t>
+            </w:r>
           </w:p>
         </w:tc>
         <w:tc>
@@ -19702,6 +20556,12 @@
                 <w:color w:val="FF0000"/>
               </w:rPr>
             </w:pPr>
+            <w:r>
+              <w:rPr>
+                <w:color w:val="FF0000"/>
+              </w:rPr>
+              <w:t xml:space="preserve">Các nốt phát một lượt một và thời gian sẽ rất bé </w:t>
+            </w:r>
           </w:p>
         </w:tc>
       </w:tr>
@@ -19828,8 +20688,8 @@
       </w:tblPr>
       <w:tblGrid>
         <w:gridCol w:w="1500"/>
-        <w:gridCol w:w="2000"/>
-        <w:gridCol w:w="1900"/>
+        <w:gridCol w:w="2275"/>
+        <w:gridCol w:w="1625"/>
         <w:gridCol w:w="1400"/>
         <w:gridCol w:w="2838"/>
       </w:tblGrid>
@@ -19875,7 +20735,7 @@
         </w:tc>
         <w:tc>
           <w:tcPr>
-            <w:tcW w:w="2000" w:type="dxa"/>
+            <w:tcW w:w="2275" w:type="dxa"/>
             <w:tcBorders>
               <w:top w:val="single" w:sz="4" w:space="0" w:color="7F7F7F"/>
               <w:left w:val="single" w:sz="4" w:space="0" w:color="7F7F7F"/>
@@ -19910,7 +20770,7 @@
         </w:tc>
         <w:tc>
           <w:tcPr>
-            <w:tcW w:w="1900" w:type="dxa"/>
+            <w:tcW w:w="1625" w:type="dxa"/>
             <w:tcBorders>
               <w:top w:val="single" w:sz="4" w:space="0" w:color="7F7F7F"/>
               <w:left w:val="single" w:sz="4" w:space="0" w:color="7F7F7F"/>
@@ -20053,7 +20913,7 @@
         </w:tc>
         <w:tc>
           <w:tcPr>
-            <w:tcW w:w="2000" w:type="dxa"/>
+            <w:tcW w:w="2275" w:type="dxa"/>
             <w:tcBorders>
               <w:top w:val="single" w:sz="4" w:space="0" w:color="7F7F7F"/>
               <w:left w:val="single" w:sz="4" w:space="0" w:color="7F7F7F"/>
@@ -20073,15 +20933,22 @@
             <w:pPr>
               <w:keepNext/>
               <w:spacing w:line="252" w:lineRule="auto"/>
-              <w:rPr>
-                <w:color w:val="FF0000"/>
-              </w:rPr>
-            </w:pPr>
-          </w:p>
-        </w:tc>
-        <w:tc>
-          <w:tcPr>
-            <w:tcW w:w="1900" w:type="dxa"/>
+              <w:jc w:val="left"/>
+              <w:rPr>
+                <w:color w:val="FF0000"/>
+              </w:rPr>
+            </w:pPr>
+            <w:r>
+              <w:rPr>
+                <w:color w:val="FF0000"/>
+              </w:rPr>
+              <w:t>Nghe rõ tất cả nốt phát nối tiếp nhau</w:t>
+            </w:r>
+          </w:p>
+        </w:tc>
+        <w:tc>
+          <w:tcPr>
+            <w:tcW w:w="1625" w:type="dxa"/>
             <w:tcBorders>
               <w:top w:val="single" w:sz="4" w:space="0" w:color="7F7F7F"/>
               <w:left w:val="single" w:sz="4" w:space="0" w:color="7F7F7F"/>
@@ -20105,6 +20972,12 @@
                 <w:color w:val="FF0000"/>
               </w:rPr>
             </w:pPr>
+            <w:r>
+              <w:rPr>
+                <w:color w:val="FF0000"/>
+              </w:rPr>
+              <w:t>8100-8300</w:t>
+            </w:r>
           </w:p>
         </w:tc>
         <w:tc>
@@ -20133,6 +21006,12 @@
                 <w:color w:val="FF0000"/>
               </w:rPr>
             </w:pPr>
+            <w:r>
+              <w:rPr>
+                <w:color w:val="FF0000"/>
+              </w:rPr>
+              <w:t>17</w:t>
+            </w:r>
           </w:p>
         </w:tc>
         <w:tc>
@@ -20161,6 +21040,12 @@
                 <w:color w:val="FF0000"/>
               </w:rPr>
             </w:pPr>
+            <w:r>
+              <w:rPr>
+                <w:color w:val="FF0000"/>
+              </w:rPr>
+              <w:t xml:space="preserve">Syscall 33 phát xong nốt rồi mới thực thi lệnh tiếp theo. </w:t>
+            </w:r>
           </w:p>
         </w:tc>
       </w:tr>
@@ -20203,7 +21088,7 @@
         </w:tc>
         <w:tc>
           <w:tcPr>
-            <w:tcW w:w="2000" w:type="dxa"/>
+            <w:tcW w:w="2275" w:type="dxa"/>
             <w:tcBorders>
               <w:top w:val="single" w:sz="4" w:space="0" w:color="7F7F7F"/>
               <w:left w:val="single" w:sz="4" w:space="0" w:color="7F7F7F"/>
@@ -20223,15 +21108,22 @@
             <w:pPr>
               <w:keepNext/>
               <w:spacing w:line="252" w:lineRule="auto"/>
-              <w:rPr>
-                <w:color w:val="FF0000"/>
-              </w:rPr>
-            </w:pPr>
-          </w:p>
-        </w:tc>
-        <w:tc>
-          <w:tcPr>
-            <w:tcW w:w="1900" w:type="dxa"/>
+              <w:jc w:val="left"/>
+              <w:rPr>
+                <w:color w:val="FF0000"/>
+              </w:rPr>
+            </w:pPr>
+            <w:r>
+              <w:rPr>
+                <w:color w:val="FF0000"/>
+              </w:rPr>
+              <w:t>Các nốt phát cùng lúc nên âm thanh khá hỗn loạn</w:t>
+            </w:r>
+          </w:p>
+        </w:tc>
+        <w:tc>
+          <w:tcPr>
+            <w:tcW w:w="1625" w:type="dxa"/>
             <w:tcBorders>
               <w:top w:val="single" w:sz="4" w:space="0" w:color="7F7F7F"/>
               <w:left w:val="single" w:sz="4" w:space="0" w:color="7F7F7F"/>
@@ -20255,6 +21147,12 @@
                 <w:color w:val="FF0000"/>
               </w:rPr>
             </w:pPr>
+            <w:r>
+              <w:rPr>
+                <w:color w:val="FF0000"/>
+              </w:rPr>
+              <w:t>3</w:t>
+            </w:r>
           </w:p>
         </w:tc>
         <w:tc>
@@ -20283,6 +21181,12 @@
                 <w:color w:val="FF0000"/>
               </w:rPr>
             </w:pPr>
+            <w:r>
+              <w:rPr>
+                <w:color w:val="FF0000"/>
+              </w:rPr>
+              <w:t>17</w:t>
+            </w:r>
           </w:p>
         </w:tc>
         <w:tc>
@@ -20311,6 +21215,12 @@
                 <w:color w:val="FF0000"/>
               </w:rPr>
             </w:pPr>
+            <w:r>
+              <w:rPr>
+                <w:color w:val="FF0000"/>
+              </w:rPr>
+              <w:t>Syscall 31 khiến các vòng lặp chạy qua cùng một lúc</w:t>
+            </w:r>
           </w:p>
         </w:tc>
       </w:tr>
@@ -20352,7 +21262,7 @@
         </w:tc>
         <w:tc>
           <w:tcPr>
-            <w:tcW w:w="2000" w:type="dxa"/>
+            <w:tcW w:w="2275" w:type="dxa"/>
             <w:tcBorders>
               <w:top w:val="single" w:sz="4" w:space="0" w:color="7F7F7F"/>
               <w:left w:val="single" w:sz="4" w:space="0" w:color="7F7F7F"/>
@@ -20371,15 +21281,34 @@
           <w:p>
             <w:pPr>
               <w:spacing w:line="252" w:lineRule="auto"/>
-              <w:rPr>
-                <w:color w:val="FF0000"/>
-              </w:rPr>
-            </w:pPr>
-          </w:p>
-        </w:tc>
-        <w:tc>
-          <w:tcPr>
-            <w:tcW w:w="1900" w:type="dxa"/>
+              <w:jc w:val="left"/>
+              <w:rPr>
+                <w:color w:val="FF0000"/>
+              </w:rPr>
+            </w:pPr>
+            <w:r>
+              <w:rPr>
+                <w:color w:val="FF0000"/>
+              </w:rPr>
+              <w:t>Nghe rõ từng nốt nhạc nối tiếp nhau, gia</w:t>
+            </w:r>
+            <w:r>
+              <w:rPr>
+                <w:color w:val="FF0000"/>
+              </w:rPr>
+              <w:t xml:space="preserve">i </w:t>
+            </w:r>
+            <w:r>
+              <w:rPr>
+                <w:color w:val="FF0000"/>
+              </w:rPr>
+              <w:t>điệu bình thường y hệt như cấu hình A.</w:t>
+            </w:r>
+          </w:p>
+        </w:tc>
+        <w:tc>
+          <w:tcPr>
+            <w:tcW w:w="1625" w:type="dxa"/>
             <w:tcBorders>
               <w:top w:val="single" w:sz="4" w:space="0" w:color="7F7F7F"/>
               <w:left w:val="single" w:sz="4" w:space="0" w:color="7F7F7F"/>
@@ -20402,6 +21331,12 @@
                 <w:color w:val="FF0000"/>
               </w:rPr>
             </w:pPr>
+            <w:r>
+              <w:rPr>
+                <w:color w:val="FF0000"/>
+              </w:rPr>
+              <w:t>6415</w:t>
+            </w:r>
           </w:p>
         </w:tc>
         <w:tc>
@@ -20429,6 +21364,12 @@
                 <w:color w:val="FF0000"/>
               </w:rPr>
             </w:pPr>
+            <w:r>
+              <w:rPr>
+                <w:color w:val="FF0000"/>
+              </w:rPr>
+              <w:t>17</w:t>
+            </w:r>
           </w:p>
         </w:tc>
         <w:tc>
@@ -20456,6 +21397,12 @@
                 <w:color w:val="FF0000"/>
               </w:rPr>
             </w:pPr>
+            <w:r>
+              <w:rPr>
+                <w:color w:val="FF0000"/>
+              </w:rPr>
+              <w:t>Syscall 32 đã tạo ra độ trễ khớp với nốt nhạc, kết quả tạo ra giống syscall 33 nhưng thời gian do người dùng kiểm soát</w:t>
+            </w:r>
           </w:p>
         </w:tc>
       </w:tr>
@@ -20539,6 +21486,16 @@
                 <w:szCs w:val="20"/>
               </w:rPr>
               <w:t>Trả lời:</w:t>
+            </w:r>
+            <w:r>
+              <w:rPr>
+                <w:i/>
+                <w:iCs/>
+                <w:color w:val="FF0000"/>
+                <w:sz w:val="20"/>
+                <w:szCs w:val="20"/>
+              </w:rPr>
+              <w:t xml:space="preserve"> ở cấu hình A sau khi thực hiện xong một nốt thì còn gặp đỗ trệ của CPU do thực hiện các lệnh khác như lệnh nhảy , lệnh tính toán . Bên cạnh đó còn là chi phí thời gian của hệ điều hành khi xử lí các ngắt I/O liên tục</w:t>
             </w:r>
           </w:p>
         </w:tc>
@@ -20655,18 +21612,58 @@
           <w:p>
             <w:pPr>
               <w:rPr>
-                <w:color w:val="FF0000"/>
-              </w:rPr>
-            </w:pPr>
-            <w:r>
-              <w:rPr>
                 <w:i/>
                 <w:iCs/>
                 <w:color w:val="FF0000"/>
                 <w:sz w:val="20"/>
                 <w:szCs w:val="20"/>
               </w:rPr>
+            </w:pPr>
+            <w:r>
+              <w:rPr>
+                <w:i/>
+                <w:iCs/>
+                <w:color w:val="FF0000"/>
+                <w:sz w:val="20"/>
+                <w:szCs w:val="20"/>
+              </w:rPr>
               <w:t>Trả lời:</w:t>
+            </w:r>
+            <w:r>
+              <w:rPr>
+                <w:i/>
+                <w:iCs/>
+                <w:color w:val="FF0000"/>
+                <w:sz w:val="20"/>
+                <w:szCs w:val="20"/>
+              </w:rPr>
+              <w:t xml:space="preserve"> Lệnh nạp phần tử sẽ chuyển từ lw sang lb / lbu . còn i sẽ là addiu $t0,$t0,1 ( tiến tới 1 byte thay vì 4 byte )</w:t>
+            </w:r>
+          </w:p>
+          <w:p>
+            <w:pPr>
+              <w:pStyle w:val="ListParagraph"/>
+              <w:numPr>
+                <w:ilvl w:val="0"/>
+                <w:numId w:val="4"/>
+              </w:numPr>
+              <w:rPr>
+                <w:i/>
+                <w:iCs/>
+                <w:color w:val="FF0000"/>
+                <w:sz w:val="20"/>
+                <w:szCs w:val="20"/>
+              </w:rPr>
+            </w:pPr>
+            <w:r>
+              <w:rPr>
+                <w:i/>
+                <w:iCs/>
+                <w:color w:val="FF0000"/>
+                <w:sz w:val="20"/>
+                <w:szCs w:val="20"/>
+              </w:rPr>
+              <w:t>Nên chọn lên lbu vì dải giá trị cao độ MIDI luôn là số không âm do đó dùng lbu sẽ ngăn CPU tự mở ộng bit dấu làm thay đổi sai lệch mã phị phân khi nạp</w:t>
             </w:r>
           </w:p>
         </w:tc>
@@ -20739,18 +21736,49 @@
           <w:p>
             <w:pPr>
               <w:rPr>
-                <w:color w:val="FF0000"/>
-              </w:rPr>
-            </w:pPr>
-            <w:r>
-              <w:rPr>
                 <w:i/>
                 <w:iCs/>
                 <w:color w:val="FF0000"/>
                 <w:sz w:val="20"/>
                 <w:szCs w:val="20"/>
               </w:rPr>
+            </w:pPr>
+            <w:r>
+              <w:rPr>
+                <w:i/>
+                <w:iCs/>
+                <w:color w:val="FF0000"/>
+                <w:sz w:val="20"/>
+                <w:szCs w:val="20"/>
+              </w:rPr>
               <w:t>Trả lời:</w:t>
+            </w:r>
+            <w:r>
+              <w:rPr>
+                <w:i/>
+                <w:iCs/>
+                <w:color w:val="FF0000"/>
+                <w:sz w:val="20"/>
+                <w:szCs w:val="20"/>
+              </w:rPr>
+              <w:t xml:space="preserve"> Nên dùng cấu hình B , vì syscall 31 trả quyền điều khiển lại cho chương trình ngay lúc đó , giúp giải phóng CPU để tranh thủ đọc dữ liệu khác .</w:t>
+            </w:r>
+          </w:p>
+          <w:p>
+            <w:pPr>
+              <w:rPr>
+                <w:color w:val="FF0000"/>
+              </w:rPr>
+            </w:pPr>
+            <w:r>
+              <w:rPr>
+                <w:i/>
+                <w:iCs/>
+                <w:color w:val="FF0000"/>
+                <w:sz w:val="20"/>
+                <w:szCs w:val="20"/>
+              </w:rPr>
+              <w:t xml:space="preserve">Rủi ro : phát nốt liên tục , không độ trễ , dẫn đến âm thanh hỗn loạn </w:t>
             </w:r>
           </w:p>
         </w:tc>
@@ -20893,7 +21921,13 @@
         <w:t>Bước 4.1 – Đo số lệnh thực thi.</w:t>
       </w:r>
       <w:r>
-        <w:t xml:space="preserve"> Mở Instruction Counter (Connect to MIPS). Với mỗi x ở Bảng 15, đặt lại bộ đếm, chạy, ghi tổng số lệnh thực thi. Đo x = 10 và x = 120 trước.</w:t>
+        <w:t xml:space="preserve"> Mở Instruction C</w:t>
+      </w:r>
+      <w:r>
+        <w:t xml:space="preserve"> </w:t>
+      </w:r>
+      <w:r>
+        <w:t>ounter (Connect to MIPS). Với mỗi x ở Bảng 15, đặt lại bộ đếm, chạy, ghi tổng số lệnh thực thi. Đo x = 10 và x = 120 trước.</w:t>
       </w:r>
     </w:p>
     <w:p>
@@ -21203,10 +22237,17 @@
             <w:pPr>
               <w:keepNext/>
               <w:spacing w:line="252" w:lineRule="auto"/>
-              <w:rPr>
-                <w:color w:val="FF0000"/>
-              </w:rPr>
-            </w:pPr>
+              <w:jc w:val="center"/>
+              <w:rPr>
+                <w:color w:val="FF0000"/>
+              </w:rPr>
+            </w:pPr>
+            <w:r>
+              <w:rPr>
+                <w:color w:val="FF0000"/>
+              </w:rPr>
+              <w:t>0</w:t>
+            </w:r>
           </w:p>
         </w:tc>
         <w:tc>
@@ -21263,10 +22304,17 @@
             <w:pPr>
               <w:keepNext/>
               <w:spacing w:line="252" w:lineRule="auto"/>
-              <w:rPr>
-                <w:color w:val="FF0000"/>
-              </w:rPr>
-            </w:pPr>
+              <w:jc w:val="center"/>
+              <w:rPr>
+                <w:color w:val="FF0000"/>
+              </w:rPr>
+            </w:pPr>
+            <w:r>
+              <w:rPr>
+                <w:color w:val="FF0000"/>
+              </w:rPr>
+              <w:t>36</w:t>
+            </w:r>
           </w:p>
         </w:tc>
         <w:tc>
@@ -21361,10 +22409,17 @@
             <w:pPr>
               <w:keepNext/>
               <w:spacing w:line="252" w:lineRule="auto"/>
-              <w:rPr>
-                <w:color w:val="FF0000"/>
-              </w:rPr>
-            </w:pPr>
+              <w:jc w:val="center"/>
+              <w:rPr>
+                <w:color w:val="FF0000"/>
+              </w:rPr>
+            </w:pPr>
+            <w:r>
+              <w:rPr>
+                <w:color w:val="FF0000"/>
+              </w:rPr>
+              <w:t>2</w:t>
+            </w:r>
           </w:p>
         </w:tc>
         <w:tc>
@@ -21421,10 +22476,17 @@
             <w:pPr>
               <w:keepNext/>
               <w:spacing w:line="252" w:lineRule="auto"/>
-              <w:rPr>
-                <w:color w:val="FF0000"/>
-              </w:rPr>
-            </w:pPr>
+              <w:jc w:val="center"/>
+              <w:rPr>
+                <w:color w:val="FF0000"/>
+              </w:rPr>
+            </w:pPr>
+            <w:r>
+              <w:rPr>
+                <w:color w:val="FF0000"/>
+              </w:rPr>
+              <w:t>58</w:t>
+            </w:r>
           </w:p>
         </w:tc>
         <w:tc>
@@ -21519,10 +22581,17 @@
             <w:pPr>
               <w:keepNext/>
               <w:spacing w:line="252" w:lineRule="auto"/>
-              <w:rPr>
-                <w:color w:val="FF0000"/>
-              </w:rPr>
-            </w:pPr>
+              <w:jc w:val="center"/>
+              <w:rPr>
+                <w:color w:val="FF0000"/>
+              </w:rPr>
+            </w:pPr>
+            <w:r>
+              <w:rPr>
+                <w:color w:val="FF0000"/>
+              </w:rPr>
+              <w:t>1</w:t>
+            </w:r>
           </w:p>
         </w:tc>
         <w:tc>
@@ -21547,10 +22616,17 @@
             <w:pPr>
               <w:keepNext/>
               <w:spacing w:line="252" w:lineRule="auto"/>
-              <w:rPr>
-                <w:color w:val="FF0000"/>
-              </w:rPr>
-            </w:pPr>
+              <w:jc w:val="center"/>
+              <w:rPr>
+                <w:color w:val="FF0000"/>
+              </w:rPr>
+            </w:pPr>
+            <w:r>
+              <w:rPr>
+                <w:color w:val="FF0000"/>
+              </w:rPr>
+              <w:t>36</w:t>
+            </w:r>
           </w:p>
         </w:tc>
         <w:tc>
@@ -21575,10 +22651,17 @@
             <w:pPr>
               <w:keepNext/>
               <w:spacing w:line="252" w:lineRule="auto"/>
-              <w:rPr>
-                <w:color w:val="FF0000"/>
-              </w:rPr>
-            </w:pPr>
+              <w:jc w:val="center"/>
+              <w:rPr>
+                <w:color w:val="FF0000"/>
+              </w:rPr>
+            </w:pPr>
+            <w:r>
+              <w:rPr>
+                <w:color w:val="FF0000"/>
+              </w:rPr>
+              <w:t>36</w:t>
+            </w:r>
           </w:p>
         </w:tc>
         <w:tc>
@@ -21603,10 +22686,17 @@
             <w:pPr>
               <w:keepNext/>
               <w:spacing w:line="252" w:lineRule="auto"/>
-              <w:rPr>
-                <w:color w:val="FF0000"/>
-              </w:rPr>
-            </w:pPr>
+              <w:jc w:val="center"/>
+              <w:rPr>
+                <w:color w:val="FF0000"/>
+              </w:rPr>
+            </w:pPr>
+            <w:r>
+              <w:rPr>
+                <w:color w:val="FF0000"/>
+              </w:rPr>
+              <w:t>0</w:t>
+            </w:r>
           </w:p>
         </w:tc>
       </w:tr>
@@ -21669,10 +22759,17 @@
             <w:pPr>
               <w:keepNext/>
               <w:spacing w:line="252" w:lineRule="auto"/>
-              <w:rPr>
-                <w:color w:val="FF0000"/>
-              </w:rPr>
-            </w:pPr>
+              <w:jc w:val="center"/>
+              <w:rPr>
+                <w:color w:val="FF0000"/>
+              </w:rPr>
+            </w:pPr>
+            <w:r>
+              <w:rPr>
+                <w:color w:val="FF0000"/>
+              </w:rPr>
+              <w:t>4</w:t>
+            </w:r>
           </w:p>
         </w:tc>
         <w:tc>
@@ -21697,10 +22794,17 @@
             <w:pPr>
               <w:keepNext/>
               <w:spacing w:line="252" w:lineRule="auto"/>
-              <w:rPr>
-                <w:color w:val="FF0000"/>
-              </w:rPr>
-            </w:pPr>
+              <w:jc w:val="center"/>
+              <w:rPr>
+                <w:color w:val="FF0000"/>
+              </w:rPr>
+            </w:pPr>
+            <w:r>
+              <w:rPr>
+                <w:color w:val="FF0000"/>
+              </w:rPr>
+              <w:t>69</w:t>
+            </w:r>
           </w:p>
         </w:tc>
         <w:tc>
@@ -21725,10 +22829,17 @@
             <w:pPr>
               <w:keepNext/>
               <w:spacing w:line="252" w:lineRule="auto"/>
-              <w:rPr>
-                <w:color w:val="FF0000"/>
-              </w:rPr>
-            </w:pPr>
+              <w:jc w:val="center"/>
+              <w:rPr>
+                <w:color w:val="FF0000"/>
+              </w:rPr>
+            </w:pPr>
+            <w:r>
+              <w:rPr>
+                <w:color w:val="FF0000"/>
+              </w:rPr>
+              <w:t>69</w:t>
+            </w:r>
           </w:p>
         </w:tc>
         <w:tc>
@@ -21753,10 +22864,17 @@
             <w:pPr>
               <w:keepNext/>
               <w:spacing w:line="252" w:lineRule="auto"/>
-              <w:rPr>
-                <w:color w:val="FF0000"/>
-              </w:rPr>
-            </w:pPr>
+              <w:jc w:val="center"/>
+              <w:rPr>
+                <w:color w:val="FF0000"/>
+              </w:rPr>
+            </w:pPr>
+            <w:r>
+              <w:rPr>
+                <w:color w:val="FF0000"/>
+              </w:rPr>
+              <w:t>0</w:t>
+            </w:r>
           </w:p>
         </w:tc>
       </w:tr>
@@ -21817,10 +22935,17 @@
           <w:p>
             <w:pPr>
               <w:spacing w:line="252" w:lineRule="auto"/>
-              <w:rPr>
-                <w:color w:val="FF0000"/>
-              </w:rPr>
-            </w:pPr>
+              <w:jc w:val="center"/>
+              <w:rPr>
+                <w:color w:val="FF0000"/>
+              </w:rPr>
+            </w:pPr>
+            <w:r>
+              <w:rPr>
+                <w:color w:val="FF0000"/>
+              </w:rPr>
+              <w:t>5</w:t>
+            </w:r>
           </w:p>
         </w:tc>
         <w:tc>
@@ -21844,10 +22969,17 @@
           <w:p>
             <w:pPr>
               <w:spacing w:line="252" w:lineRule="auto"/>
-              <w:rPr>
-                <w:color w:val="FF0000"/>
-              </w:rPr>
-            </w:pPr>
+              <w:jc w:val="center"/>
+              <w:rPr>
+                <w:color w:val="FF0000"/>
+              </w:rPr>
+            </w:pPr>
+            <w:r>
+              <w:rPr>
+                <w:color w:val="FF0000"/>
+              </w:rPr>
+              <w:t>91</w:t>
+            </w:r>
           </w:p>
         </w:tc>
         <w:tc>
@@ -21871,10 +23003,17 @@
           <w:p>
             <w:pPr>
               <w:spacing w:line="252" w:lineRule="auto"/>
-              <w:rPr>
-                <w:color w:val="FF0000"/>
-              </w:rPr>
-            </w:pPr>
+              <w:jc w:val="center"/>
+              <w:rPr>
+                <w:color w:val="FF0000"/>
+              </w:rPr>
+            </w:pPr>
+            <w:r>
+              <w:rPr>
+                <w:color w:val="FF0000"/>
+              </w:rPr>
+              <w:t>91</w:t>
+            </w:r>
           </w:p>
         </w:tc>
         <w:tc>
@@ -21898,10 +23037,17 @@
           <w:p>
             <w:pPr>
               <w:spacing w:line="252" w:lineRule="auto"/>
-              <w:rPr>
-                <w:color w:val="FF0000"/>
-              </w:rPr>
-            </w:pPr>
+              <w:jc w:val="center"/>
+              <w:rPr>
+                <w:color w:val="FF0000"/>
+              </w:rPr>
+            </w:pPr>
+            <w:r>
+              <w:rPr>
+                <w:color w:val="FF0000"/>
+              </w:rPr>
+              <w:t>0</w:t>
+            </w:r>
           </w:p>
         </w:tc>
       </w:tr>
@@ -21973,18 +23119,112 @@
           <w:p>
             <w:pPr>
               <w:rPr>
-                <w:color w:val="FF0000"/>
-              </w:rPr>
-            </w:pPr>
-            <w:r>
-              <w:rPr>
                 <w:i/>
                 <w:iCs/>
                 <w:color w:val="FF0000"/>
                 <w:sz w:val="20"/>
                 <w:szCs w:val="20"/>
               </w:rPr>
+            </w:pPr>
+            <w:r>
+              <w:rPr>
+                <w:i/>
+                <w:iCs/>
+                <w:color w:val="FF0000"/>
+                <w:sz w:val="20"/>
+                <w:szCs w:val="20"/>
+              </w:rPr>
               <w:t>Trả lời:</w:t>
+            </w:r>
+            <w:r>
+              <w:rPr>
+                <w:i/>
+                <w:iCs/>
+                <w:color w:val="FF0000"/>
+                <w:sz w:val="20"/>
+                <w:szCs w:val="20"/>
+              </w:rPr>
+              <w:t xml:space="preserve"> N(x) =Ingoai + k*Itrong  = 25 + k*11</w:t>
+            </w:r>
+          </w:p>
+          <w:p>
+            <w:pPr>
+              <w:rPr>
+                <w:i/>
+                <w:iCs/>
+                <w:color w:val="FF0000"/>
+                <w:sz w:val="20"/>
+                <w:szCs w:val="20"/>
+              </w:rPr>
+            </w:pPr>
+            <w:r>
+              <w:rPr>
+                <w:i/>
+                <w:iCs/>
+                <w:color w:val="FF0000"/>
+                <w:sz w:val="20"/>
+                <w:szCs w:val="20"/>
+              </w:rPr>
+              <w:t xml:space="preserve">Trong đó : Ingoai là số lệnh cố định bên ngoài vòng lặp </w:t>
+            </w:r>
+          </w:p>
+          <w:p>
+            <w:pPr>
+              <w:rPr>
+                <w:i/>
+                <w:iCs/>
+                <w:color w:val="FF0000"/>
+                <w:sz w:val="20"/>
+                <w:szCs w:val="20"/>
+              </w:rPr>
+            </w:pPr>
+            <w:r>
+              <w:rPr>
+                <w:i/>
+                <w:iCs/>
+                <w:color w:val="FF0000"/>
+                <w:sz w:val="20"/>
+                <w:szCs w:val="20"/>
+              </w:rPr>
+              <w:t>Itrong là số lệnh thực thi trong 1 vòng lặp</w:t>
+            </w:r>
+          </w:p>
+          <w:p>
+            <w:pPr>
+              <w:rPr>
+                <w:i/>
+                <w:iCs/>
+                <w:color w:val="FF0000"/>
+                <w:sz w:val="20"/>
+                <w:szCs w:val="20"/>
+              </w:rPr>
+            </w:pPr>
+            <w:r>
+              <w:rPr>
+                <w:i/>
+                <w:iCs/>
+                <w:color w:val="FF0000"/>
+                <w:sz w:val="20"/>
+                <w:szCs w:val="20"/>
+              </w:rPr>
+              <w:t xml:space="preserve">k: số bậc điện mà x chạm tới </w:t>
+            </w:r>
+          </w:p>
+          <w:p>
+            <w:pPr>
+              <w:rPr>
+                <w:color w:val="FF0000"/>
+              </w:rPr>
+            </w:pPr>
+            <w:r>
+              <w:rPr>
+                <w:i/>
+                <w:iCs/>
+                <w:color w:val="FF0000"/>
+                <w:sz w:val="20"/>
+                <w:szCs w:val="20"/>
+              </w:rPr>
+              <w:t>N không đổi vì số lần lặp k chỉ phụ thuộc vào việc x rơi vào ranh giới của bậc nào, không phụ thuộc vào giá trị cụ thể của x lớn hay nhỏ bên trong khoảng ranh giới đó</w:t>
             </w:r>
           </w:p>
         </w:tc>
@@ -22067,18 +23307,150 @@
           <w:p>
             <w:pPr>
               <w:rPr>
-                <w:color w:val="FF0000"/>
-              </w:rPr>
-            </w:pPr>
-            <w:r>
-              <w:rPr>
                 <w:i/>
                 <w:iCs/>
                 <w:color w:val="FF0000"/>
                 <w:sz w:val="20"/>
                 <w:szCs w:val="20"/>
               </w:rPr>
+            </w:pPr>
+            <w:r>
+              <w:rPr>
+                <w:i/>
+                <w:iCs/>
+                <w:color w:val="FF0000"/>
+                <w:sz w:val="20"/>
+                <w:szCs w:val="20"/>
+              </w:rPr>
               <w:t>Trả lời:</w:t>
+            </w:r>
+            <w:r>
+              <w:rPr>
+                <w:i/>
+                <w:iCs/>
+                <w:color w:val="FF0000"/>
+                <w:sz w:val="20"/>
+                <w:szCs w:val="20"/>
+              </w:rPr>
+              <w:t xml:space="preserve"> N = 25 + 6</w:t>
+            </w:r>
+            <w:r>
+              <w:rPr>
+                <w:i/>
+                <w:iCs/>
+                <w:color w:val="FF0000"/>
+                <w:sz w:val="20"/>
+                <w:szCs w:val="20"/>
+              </w:rPr>
+              <w:t>0</w:t>
+            </w:r>
+            <w:r>
+              <w:rPr>
+                <w:i/>
+                <w:iCs/>
+                <w:color w:val="FF0000"/>
+                <w:sz w:val="20"/>
+                <w:szCs w:val="20"/>
+              </w:rPr>
+              <w:t xml:space="preserve">*11 = </w:t>
+            </w:r>
+            <w:r>
+              <w:rPr>
+                <w:i/>
+                <w:iCs/>
+                <w:color w:val="FF0000"/>
+                <w:sz w:val="20"/>
+                <w:szCs w:val="20"/>
+              </w:rPr>
+              <w:t>685</w:t>
+            </w:r>
+            <w:r>
+              <w:rPr>
+                <w:i/>
+                <w:iCs/>
+                <w:color w:val="FF0000"/>
+                <w:sz w:val="20"/>
+                <w:szCs w:val="20"/>
+              </w:rPr>
+              <w:t xml:space="preserve"> lệnh .</w:t>
+            </w:r>
+          </w:p>
+          <w:p>
+            <w:pPr>
+              <w:rPr>
+                <w:i/>
+                <w:iCs/>
+                <w:color w:val="FF0000"/>
+                <w:sz w:val="20"/>
+                <w:szCs w:val="20"/>
+              </w:rPr>
+            </w:pPr>
+            <w:r>
+              <w:rPr>
+                <w:i/>
+                <w:iCs/>
+                <w:color w:val="FF0000"/>
+                <w:sz w:val="20"/>
+                <w:szCs w:val="20"/>
+              </w:rPr>
+              <w:t xml:space="preserve">Đề xuất thay đổi : Xóa dòng </w:t>
+            </w:r>
+            <w:r>
+              <w:rPr>
+                <w:i/>
+                <w:iCs/>
+                <w:color w:val="FF0000"/>
+                <w:sz w:val="20"/>
+                <w:szCs w:val="20"/>
+              </w:rPr>
+              <w:t>blez $t4, outloop</w:t>
+            </w:r>
+            <w:r>
+              <w:rPr>
+                <w:i/>
+                <w:iCs/>
+                <w:color w:val="FF0000"/>
+                <w:sz w:val="20"/>
+                <w:szCs w:val="20"/>
+              </w:rPr>
+              <w:t xml:space="preserve"> vì </w:t>
+            </w:r>
+            <w:r>
+              <w:rPr>
+                <w:i/>
+                <w:iCs/>
+                <w:color w:val="FF0000"/>
+                <w:sz w:val="20"/>
+                <w:szCs w:val="20"/>
+              </w:rPr>
+              <w:t>ble $t4, $t1, bac_cuoi</w:t>
+            </w:r>
+            <w:r>
+              <w:rPr>
+                <w:i/>
+                <w:iCs/>
+                <w:color w:val="FF0000"/>
+                <w:sz w:val="20"/>
+                <w:szCs w:val="20"/>
+              </w:rPr>
+              <w:t xml:space="preserve"> đã bao hàm luôn trường hợp này.</w:t>
+            </w:r>
+          </w:p>
+          <w:p>
+            <w:pPr>
+              <w:rPr>
+                <w:color w:val="FF0000"/>
+              </w:rPr>
+            </w:pPr>
+            <w:r>
+              <w:rPr>
+                <w:i/>
+                <w:iCs/>
+                <w:color w:val="FF0000"/>
+                <w:sz w:val="20"/>
+                <w:szCs w:val="20"/>
+              </w:rPr>
+              <w:t>Báo cáo : N trước – 91 , N sau – 85 , giảm 6,6%</w:t>
             </w:r>
           </w:p>
         </w:tc>
@@ -22177,11 +23549,11 @@
         <w:tblLook w:val="0000" w:firstRow="0" w:lastRow="0" w:firstColumn="0" w:lastColumn="0" w:noHBand="0" w:noVBand="0"/>
       </w:tblPr>
       <w:tblGrid>
-        <w:gridCol w:w="1300"/>
-        <w:gridCol w:w="1500"/>
-        <w:gridCol w:w="1200"/>
-        <w:gridCol w:w="3638"/>
-        <w:gridCol w:w="2000"/>
+        <w:gridCol w:w="1435"/>
+        <w:gridCol w:w="1440"/>
+        <w:gridCol w:w="810"/>
+        <w:gridCol w:w="3330"/>
+        <w:gridCol w:w="2623"/>
       </w:tblGrid>
       <w:tr>
         <w:trPr>
@@ -22190,7 +23562,7 @@
         </w:trPr>
         <w:tc>
           <w:tcPr>
-            <w:tcW w:w="1300" w:type="dxa"/>
+            <w:tcW w:w="1435" w:type="dxa"/>
             <w:tcBorders>
               <w:top w:val="single" w:sz="4" w:space="0" w:color="7F7F7F"/>
               <w:left w:val="single" w:sz="4" w:space="0" w:color="7F7F7F"/>
@@ -22225,7 +23597,7 @@
         </w:tc>
         <w:tc>
           <w:tcPr>
-            <w:tcW w:w="1500" w:type="dxa"/>
+            <w:tcW w:w="1440" w:type="dxa"/>
             <w:tcBorders>
               <w:top w:val="single" w:sz="4" w:space="0" w:color="7F7F7F"/>
               <w:left w:val="single" w:sz="4" w:space="0" w:color="7F7F7F"/>
@@ -22260,7 +23632,7 @@
         </w:tc>
         <w:tc>
           <w:tcPr>
-            <w:tcW w:w="1200" w:type="dxa"/>
+            <w:tcW w:w="810" w:type="dxa"/>
             <w:tcBorders>
               <w:top w:val="single" w:sz="4" w:space="0" w:color="7F7F7F"/>
               <w:left w:val="single" w:sz="4" w:space="0" w:color="7F7F7F"/>
@@ -22295,7 +23667,7 @@
         </w:tc>
         <w:tc>
           <w:tcPr>
-            <w:tcW w:w="3638" w:type="dxa"/>
+            <w:tcW w:w="3330" w:type="dxa"/>
             <w:tcBorders>
               <w:top w:val="single" w:sz="4" w:space="0" w:color="7F7F7F"/>
               <w:left w:val="single" w:sz="4" w:space="0" w:color="7F7F7F"/>
@@ -22330,7 +23702,7 @@
         </w:tc>
         <w:tc>
           <w:tcPr>
-            <w:tcW w:w="2000" w:type="dxa"/>
+            <w:tcW w:w="2623" w:type="dxa"/>
             <w:tcBorders>
               <w:top w:val="single" w:sz="4" w:space="0" w:color="7F7F7F"/>
               <w:left w:val="single" w:sz="4" w:space="0" w:color="7F7F7F"/>
@@ -22370,7 +23742,7 @@
         </w:trPr>
         <w:tc>
           <w:tcPr>
-            <w:tcW w:w="1300" w:type="dxa"/>
+            <w:tcW w:w="1435" w:type="dxa"/>
             <w:tcBorders>
               <w:top w:val="single" w:sz="4" w:space="0" w:color="7F7F7F"/>
               <w:left w:val="single" w:sz="4" w:space="0" w:color="7F7F7F"/>
@@ -22394,11 +23766,17 @@
                 <w:color w:val="FF0000"/>
               </w:rPr>
             </w:pPr>
-          </w:p>
-        </w:tc>
-        <w:tc>
-          <w:tcPr>
-            <w:tcW w:w="1500" w:type="dxa"/>
+            <w:r>
+              <w:rPr>
+                <w:color w:val="FF0000"/>
+              </w:rPr>
+              <w:t>0x00400034</w:t>
+            </w:r>
+          </w:p>
+        </w:tc>
+        <w:tc>
+          <w:tcPr>
+            <w:tcW w:w="1440" w:type="dxa"/>
             <w:tcBorders>
               <w:top w:val="single" w:sz="4" w:space="0" w:color="7F7F7F"/>
               <w:left w:val="single" w:sz="4" w:space="0" w:color="7F7F7F"/>
@@ -22422,11 +23800,23 @@
                 <w:color w:val="FF0000"/>
               </w:rPr>
             </w:pPr>
-          </w:p>
-        </w:tc>
-        <w:tc>
-          <w:tcPr>
-            <w:tcW w:w="1200" w:type="dxa"/>
+            <w:r>
+              <w:rPr>
+                <w:color w:val="FF0000"/>
+              </w:rPr>
+              <w:t>0x</w:t>
+            </w:r>
+            <w:r>
+              <w:rPr>
+                <w:color w:val="FF0000"/>
+              </w:rPr>
+              <w:t>1100fff3</w:t>
+            </w:r>
+          </w:p>
+        </w:tc>
+        <w:tc>
+          <w:tcPr>
+            <w:tcW w:w="810" w:type="dxa"/>
             <w:tcBorders>
               <w:top w:val="single" w:sz="4" w:space="0" w:color="7F7F7F"/>
               <w:left w:val="single" w:sz="4" w:space="0" w:color="7F7F7F"/>
@@ -22450,11 +23840,17 @@
                 <w:color w:val="FF0000"/>
               </w:rPr>
             </w:pPr>
-          </w:p>
-        </w:tc>
-        <w:tc>
-          <w:tcPr>
-            <w:tcW w:w="3638" w:type="dxa"/>
+            <w:r>
+              <w:rPr>
+                <w:color w:val="FF0000"/>
+              </w:rPr>
+              <w:t>I type</w:t>
+            </w:r>
+          </w:p>
+        </w:tc>
+        <w:tc>
+          <w:tcPr>
+            <w:tcW w:w="3330" w:type="dxa"/>
             <w:tcBorders>
               <w:top w:val="single" w:sz="4" w:space="0" w:color="7F7F7F"/>
               <w:left w:val="single" w:sz="4" w:space="0" w:color="7F7F7F"/>
@@ -22478,11 +23874,23 @@
                 <w:color w:val="FF0000"/>
               </w:rPr>
             </w:pPr>
-          </w:p>
-        </w:tc>
-        <w:tc>
-          <w:tcPr>
-            <w:tcW w:w="2000" w:type="dxa"/>
+            <w:r>
+              <w:rPr>
+                <w:color w:val="FF0000"/>
+              </w:rPr>
+              <w:t xml:space="preserve">opcode = 4, rs ($t0) = 8, rt ($zero) = 0, immediate = </w:t>
+            </w:r>
+            <w:r>
+              <w:rPr>
+                <w:color w:val="FF0000"/>
+              </w:rPr>
+              <w:t>-13</w:t>
+            </w:r>
+          </w:p>
+        </w:tc>
+        <w:tc>
+          <w:tcPr>
+            <w:tcW w:w="2623" w:type="dxa"/>
             <w:tcBorders>
               <w:top w:val="single" w:sz="4" w:space="0" w:color="7F7F7F"/>
               <w:left w:val="single" w:sz="4" w:space="0" w:color="7F7F7F"/>
@@ -22506,6 +23914,12 @@
                 <w:color w:val="FF0000"/>
               </w:rPr>
             </w:pPr>
+            <w:r>
+              <w:rPr>
+                <w:color w:val="FF0000"/>
+              </w:rPr>
+              <w:t>beq $8,$0,0xfffffff3</w:t>
+            </w:r>
           </w:p>
         </w:tc>
       </w:tr>
@@ -22515,7 +23929,7 @@
         </w:trPr>
         <w:tc>
           <w:tcPr>
-            <w:tcW w:w="1300" w:type="dxa"/>
+            <w:tcW w:w="1435" w:type="dxa"/>
             <w:tcBorders>
               <w:top w:val="single" w:sz="4" w:space="0" w:color="7F7F7F"/>
               <w:left w:val="single" w:sz="4" w:space="0" w:color="7F7F7F"/>
@@ -22539,11 +23953,23 @@
                 <w:color w:val="FF0000"/>
               </w:rPr>
             </w:pPr>
-          </w:p>
-        </w:tc>
-        <w:tc>
-          <w:tcPr>
-            <w:tcW w:w="1500" w:type="dxa"/>
+            <w:r>
+              <w:rPr>
+                <w:color w:val="FF0000"/>
+              </w:rPr>
+              <w:t>0x004000</w:t>
+            </w:r>
+            <w:r>
+              <w:rPr>
+                <w:color w:val="FF0000"/>
+              </w:rPr>
+              <w:t>50</w:t>
+            </w:r>
+          </w:p>
+        </w:tc>
+        <w:tc>
+          <w:tcPr>
+            <w:tcW w:w="1440" w:type="dxa"/>
             <w:tcBorders>
               <w:top w:val="single" w:sz="4" w:space="0" w:color="7F7F7F"/>
               <w:left w:val="single" w:sz="4" w:space="0" w:color="7F7F7F"/>
@@ -22567,11 +23993,23 @@
                 <w:color w:val="FF0000"/>
               </w:rPr>
             </w:pPr>
-          </w:p>
-        </w:tc>
-        <w:tc>
-          <w:tcPr>
-            <w:tcW w:w="1200" w:type="dxa"/>
+            <w:r>
+              <w:rPr>
+                <w:color w:val="FF0000"/>
+              </w:rPr>
+              <w:t>0x</w:t>
+            </w:r>
+            <w:r>
+              <w:rPr>
+                <w:color w:val="FF0000"/>
+              </w:rPr>
+              <w:t>8e490000</w:t>
+            </w:r>
+          </w:p>
+        </w:tc>
+        <w:tc>
+          <w:tcPr>
+            <w:tcW w:w="810" w:type="dxa"/>
             <w:tcBorders>
               <w:top w:val="single" w:sz="4" w:space="0" w:color="7F7F7F"/>
               <w:left w:val="single" w:sz="4" w:space="0" w:color="7F7F7F"/>
@@ -22595,11 +24033,17 @@
                 <w:color w:val="FF0000"/>
               </w:rPr>
             </w:pPr>
-          </w:p>
-        </w:tc>
-        <w:tc>
-          <w:tcPr>
-            <w:tcW w:w="3638" w:type="dxa"/>
+            <w:r>
+              <w:rPr>
+                <w:color w:val="FF0000"/>
+              </w:rPr>
+              <w:t>I type</w:t>
+            </w:r>
+          </w:p>
+        </w:tc>
+        <w:tc>
+          <w:tcPr>
+            <w:tcW w:w="3330" w:type="dxa"/>
             <w:tcBorders>
               <w:top w:val="single" w:sz="4" w:space="0" w:color="7F7F7F"/>
               <w:left w:val="single" w:sz="4" w:space="0" w:color="7F7F7F"/>
@@ -22627,7 +24071,7 @@
         </w:tc>
         <w:tc>
           <w:tcPr>
-            <w:tcW w:w="2000" w:type="dxa"/>
+            <w:tcW w:w="2623" w:type="dxa"/>
             <w:tcBorders>
               <w:top w:val="single" w:sz="4" w:space="0" w:color="7F7F7F"/>
               <w:left w:val="single" w:sz="4" w:space="0" w:color="7F7F7F"/>
@@ -22651,6 +24095,12 @@
                 <w:color w:val="FF0000"/>
               </w:rPr>
             </w:pPr>
+            <w:r>
+              <w:rPr>
+                <w:color w:val="FF0000"/>
+              </w:rPr>
+              <w:t>lw $9,0x00000000($18)</w:t>
+            </w:r>
           </w:p>
         </w:tc>
       </w:tr>
@@ -22660,7 +24110,7 @@
         </w:trPr>
         <w:tc>
           <w:tcPr>
-            <w:tcW w:w="1300" w:type="dxa"/>
+            <w:tcW w:w="1435" w:type="dxa"/>
             <w:tcBorders>
               <w:top w:val="single" w:sz="4" w:space="0" w:color="7F7F7F"/>
               <w:left w:val="single" w:sz="4" w:space="0" w:color="7F7F7F"/>
@@ -22683,11 +24133,23 @@
                 <w:color w:val="FF0000"/>
               </w:rPr>
             </w:pPr>
-          </w:p>
-        </w:tc>
-        <w:tc>
-          <w:tcPr>
-            <w:tcW w:w="1500" w:type="dxa"/>
+            <w:r>
+              <w:rPr>
+                <w:color w:val="FF0000"/>
+              </w:rPr>
+              <w:t>0x0040003</w:t>
+            </w:r>
+            <w:r>
+              <w:rPr>
+                <w:color w:val="FF0000"/>
+              </w:rPr>
+              <w:t>0</w:t>
+            </w:r>
+          </w:p>
+        </w:tc>
+        <w:tc>
+          <w:tcPr>
+            <w:tcW w:w="1440" w:type="dxa"/>
             <w:tcBorders>
               <w:top w:val="single" w:sz="4" w:space="0" w:color="7F7F7F"/>
               <w:left w:val="single" w:sz="4" w:space="0" w:color="7F7F7F"/>
@@ -22710,11 +24172,17 @@
                 <w:color w:val="FF0000"/>
               </w:rPr>
             </w:pPr>
-          </w:p>
-        </w:tc>
-        <w:tc>
-          <w:tcPr>
-            <w:tcW w:w="1200" w:type="dxa"/>
+            <w:r>
+              <w:rPr>
+                <w:color w:val="FF0000"/>
+              </w:rPr>
+              <w:t>0x2a082710</w:t>
+            </w:r>
+          </w:p>
+        </w:tc>
+        <w:tc>
+          <w:tcPr>
+            <w:tcW w:w="810" w:type="dxa"/>
             <w:tcBorders>
               <w:top w:val="single" w:sz="4" w:space="0" w:color="7F7F7F"/>
               <w:left w:val="single" w:sz="4" w:space="0" w:color="7F7F7F"/>
@@ -22737,11 +24205,17 @@
                 <w:color w:val="FF0000"/>
               </w:rPr>
             </w:pPr>
-          </w:p>
-        </w:tc>
-        <w:tc>
-          <w:tcPr>
-            <w:tcW w:w="3638" w:type="dxa"/>
+            <w:r>
+              <w:rPr>
+                <w:color w:val="FF0000"/>
+              </w:rPr>
+              <w:t>I type</w:t>
+            </w:r>
+          </w:p>
+        </w:tc>
+        <w:tc>
+          <w:tcPr>
+            <w:tcW w:w="3330" w:type="dxa"/>
             <w:tcBorders>
               <w:top w:val="single" w:sz="4" w:space="0" w:color="7F7F7F"/>
               <w:left w:val="single" w:sz="4" w:space="0" w:color="7F7F7F"/>
@@ -22764,11 +24238,17 @@
                 <w:color w:val="FF0000"/>
               </w:rPr>
             </w:pPr>
-          </w:p>
-        </w:tc>
-        <w:tc>
-          <w:tcPr>
-            <w:tcW w:w="2000" w:type="dxa"/>
+            <w:r>
+              <w:rPr>
+                <w:color w:val="FF0000"/>
+              </w:rPr>
+              <w:t>opcode = 10, rs = 16, rt = 8, imm = 10000</w:t>
+            </w:r>
+          </w:p>
+        </w:tc>
+        <w:tc>
+          <w:tcPr>
+            <w:tcW w:w="2623" w:type="dxa"/>
             <w:tcBorders>
               <w:top w:val="single" w:sz="4" w:space="0" w:color="7F7F7F"/>
               <w:left w:val="single" w:sz="4" w:space="0" w:color="7F7F7F"/>
@@ -22791,6 +24271,12 @@
                 <w:color w:val="FF0000"/>
               </w:rPr>
             </w:pPr>
+            <w:r>
+              <w:rPr>
+                <w:color w:val="FF0000"/>
+              </w:rPr>
+              <w:t>lti $8,$16,0x00002710</w:t>
+            </w:r>
           </w:p>
         </w:tc>
       </w:tr>
@@ -22862,18 +24348,110 @@
           <w:p>
             <w:pPr>
               <w:rPr>
-                <w:color w:val="FF0000"/>
-              </w:rPr>
-            </w:pPr>
-            <w:r>
-              <w:rPr>
                 <w:i/>
                 <w:iCs/>
                 <w:color w:val="FF0000"/>
                 <w:sz w:val="20"/>
                 <w:szCs w:val="20"/>
               </w:rPr>
+            </w:pPr>
+            <w:r>
+              <w:rPr>
+                <w:i/>
+                <w:iCs/>
+                <w:color w:val="FF0000"/>
+                <w:sz w:val="20"/>
+                <w:szCs w:val="20"/>
+              </w:rPr>
               <w:t>Trả lời:</w:t>
+            </w:r>
+            <w:r>
+              <w:rPr>
+                <w:i/>
+                <w:iCs/>
+                <w:color w:val="FF0000"/>
+                <w:sz w:val="20"/>
+                <w:szCs w:val="20"/>
+              </w:rPr>
+              <w:t xml:space="preserve"> giả sử địch chỉ đích là nhãn wronginput</w:t>
+            </w:r>
+          </w:p>
+          <w:p>
+            <w:pPr>
+              <w:rPr>
+                <w:i/>
+                <w:iCs/>
+                <w:color w:val="FF0000"/>
+                <w:sz w:val="20"/>
+                <w:szCs w:val="20"/>
+              </w:rPr>
+            </w:pPr>
+            <w:r>
+              <w:rPr>
+                <w:i/>
+                <w:iCs/>
+                <w:color w:val="FF0000"/>
+                <w:sz w:val="20"/>
+                <w:szCs w:val="20"/>
+              </w:rPr>
+              <w:t xml:space="preserve">Ta có : (địa chỉ đích – (địa chỉ lệnh +4)/4) = (0x00400004 – (0x0040034+4))/4 =-13 . Kết quả này khớp với trường immediate của bảng 16. </w:t>
+            </w:r>
+          </w:p>
+          <w:p>
+            <w:pPr>
+              <w:rPr>
+                <w:color w:val="FF0000"/>
+              </w:rPr>
+            </w:pPr>
+            <w:r>
+              <w:rPr>
+                <w:i/>
+                <w:iCs/>
+                <w:color w:val="FF0000"/>
+                <w:sz w:val="20"/>
+                <w:szCs w:val="20"/>
+              </w:rPr>
+              <w:t>Trường immediate 16 bit biểu diễn được các số nguyên có dấu từ</w:t>
+            </w:r>
+            <w:r>
+              <w:rPr>
+                <w:i/>
+                <w:iCs/>
+                <w:color w:val="FF0000"/>
+                <w:sz w:val="20"/>
+                <w:szCs w:val="20"/>
+              </w:rPr>
+              <w:t xml:space="preserve"> -2^15 </w:t>
+            </w:r>
+            <w:r>
+              <w:rPr>
+                <w:i/>
+                <w:iCs/>
+                <w:color w:val="FF0000"/>
+                <w:sz w:val="20"/>
+                <w:szCs w:val="20"/>
+              </w:rPr>
+              <w:t xml:space="preserve"> đến </w:t>
+            </w:r>
+            <w:r>
+              <w:rPr>
+                <w:i/>
+                <w:iCs/>
+                <w:color w:val="FF0000"/>
+                <w:sz w:val="20"/>
+                <w:szCs w:val="20"/>
+              </w:rPr>
+              <w:t xml:space="preserve">2^15 – 1 </w:t>
+            </w:r>
+            <w:r>
+              <w:rPr>
+                <w:i/>
+                <w:iCs/>
+                <w:color w:val="FF0000"/>
+                <w:sz w:val="20"/>
+                <w:szCs w:val="20"/>
+              </w:rPr>
+              <w:t xml:space="preserve"> (từ -32768 đến 32767). Do mỗi lệnh chiếm 4 byte, một lệnh nhánh có thể nhảy đến các địa chỉ trong khoảng từ -131.072 byte đến +131.068 byte so với lệnh kế tiếp.</w:t>
             </w:r>
           </w:p>
         </w:tc>
@@ -23070,6 +24648,12 @@
                 <w:color w:val="FF0000"/>
               </w:rPr>
             </w:pPr>
+            <w:r>
+              <w:rPr>
+                <w:color w:val="FF0000"/>
+              </w:rPr>
+              <w:t>la $a0, input</w:t>
+            </w:r>
           </w:p>
         </w:tc>
         <w:tc>
@@ -23098,6 +24682,27 @@
                 <w:color w:val="FF0000"/>
               </w:rPr>
             </w:pPr>
+            <w:r>
+              <w:rPr>
+                <w:color w:val="FF0000"/>
+              </w:rPr>
+              <w:t>lui $1, 0x00001001</w:t>
+            </w:r>
+          </w:p>
+          <w:p>
+            <w:pPr>
+              <w:keepNext/>
+              <w:spacing w:line="252" w:lineRule="auto"/>
+              <w:rPr>
+                <w:color w:val="FF0000"/>
+              </w:rPr>
+            </w:pPr>
+            <w:r>
+              <w:rPr>
+                <w:color w:val="FF0000"/>
+              </w:rPr>
+              <w:t>ori $4, $1, 0x00000000</w:t>
+            </w:r>
           </w:p>
         </w:tc>
         <w:tc>
@@ -23126,6 +24731,12 @@
                 <w:color w:val="FF0000"/>
               </w:rPr>
             </w:pPr>
+            <w:r>
+              <w:rPr>
+                <w:color w:val="FF0000"/>
+              </w:rPr>
+              <w:t>2</w:t>
+            </w:r>
           </w:p>
         </w:tc>
       </w:tr>
@@ -23159,6 +24770,12 @@
                 <w:color w:val="FF0000"/>
               </w:rPr>
             </w:pPr>
+            <w:r>
+              <w:rPr>
+                <w:color w:val="FF0000"/>
+              </w:rPr>
+              <w:t>li $v0, 4</w:t>
+            </w:r>
           </w:p>
         </w:tc>
         <w:tc>
@@ -23187,6 +24804,12 @@
                 <w:color w:val="FF0000"/>
               </w:rPr>
             </w:pPr>
+            <w:r>
+              <w:rPr>
+                <w:color w:val="FF0000"/>
+              </w:rPr>
+              <w:t>addiu $2, $0, 0x00000004</w:t>
+            </w:r>
           </w:p>
         </w:tc>
         <w:tc>
@@ -23215,6 +24838,12 @@
                 <w:color w:val="FF0000"/>
               </w:rPr>
             </w:pPr>
+            <w:r>
+              <w:rPr>
+                <w:color w:val="FF0000"/>
+              </w:rPr>
+              <w:t>1</w:t>
+            </w:r>
           </w:p>
         </w:tc>
       </w:tr>
@@ -23247,6 +24876,12 @@
                 <w:color w:val="FF0000"/>
               </w:rPr>
             </w:pPr>
+            <w:r>
+              <w:rPr>
+                <w:color w:val="FF0000"/>
+              </w:rPr>
+              <w:t>ble $t4, $t1, bac_cuoi</w:t>
+            </w:r>
           </w:p>
         </w:tc>
         <w:tc>
@@ -23274,6 +24909,26 @@
                 <w:color w:val="FF0000"/>
               </w:rPr>
             </w:pPr>
+            <w:r>
+              <w:rPr>
+                <w:color w:val="FF0000"/>
+              </w:rPr>
+              <w:t>slt $1, $9, $12</w:t>
+            </w:r>
+          </w:p>
+          <w:p>
+            <w:pPr>
+              <w:spacing w:line="252" w:lineRule="auto"/>
+              <w:rPr>
+                <w:color w:val="FF0000"/>
+              </w:rPr>
+            </w:pPr>
+            <w:r>
+              <w:rPr>
+                <w:color w:val="FF0000"/>
+              </w:rPr>
+              <w:t>beq $1, $0, 0x00000006</w:t>
+            </w:r>
           </w:p>
         </w:tc>
         <w:tc>
@@ -23301,6 +24956,12 @@
                 <w:color w:val="FF0000"/>
               </w:rPr>
             </w:pPr>
+            <w:r>
+              <w:rPr>
+                <w:color w:val="FF0000"/>
+              </w:rPr>
+              <w:t>2</w:t>
+            </w:r>
           </w:p>
         </w:tc>
       </w:tr>
@@ -23372,18 +25033,112 @@
           <w:p>
             <w:pPr>
               <w:rPr>
-                <w:color w:val="FF0000"/>
-              </w:rPr>
-            </w:pPr>
-            <w:r>
-              <w:rPr>
                 <w:i/>
                 <w:iCs/>
                 <w:color w:val="FF0000"/>
                 <w:sz w:val="20"/>
                 <w:szCs w:val="20"/>
               </w:rPr>
+            </w:pPr>
+            <w:r>
+              <w:rPr>
+                <w:i/>
+                <w:iCs/>
+                <w:color w:val="FF0000"/>
+                <w:sz w:val="20"/>
+                <w:szCs w:val="20"/>
+              </w:rPr>
               <w:t>Trả lời:</w:t>
+            </w:r>
+            <w:r>
+              <w:rPr>
+                <w:i/>
+                <w:iCs/>
+                <w:color w:val="FF0000"/>
+                <w:sz w:val="20"/>
+                <w:szCs w:val="20"/>
+              </w:rPr>
+              <w:t xml:space="preserve"> </w:t>
+            </w:r>
+          </w:p>
+          <w:p>
+            <w:pPr>
+              <w:rPr>
+                <w:i/>
+                <w:iCs/>
+                <w:color w:val="FF0000"/>
+                <w:sz w:val="20"/>
+                <w:szCs w:val="20"/>
+              </w:rPr>
+            </w:pPr>
+            <w:r>
+              <w:rPr>
+                <w:i/>
+                <w:iCs/>
+                <w:color w:val="FF0000"/>
+                <w:sz w:val="20"/>
+                <w:szCs w:val="20"/>
+              </w:rPr>
+              <w:t>+ Số dòng lệnh nguồn : 38</w:t>
+            </w:r>
+          </w:p>
+          <w:p>
+            <w:pPr>
+              <w:rPr>
+                <w:i/>
+                <w:iCs/>
+                <w:color w:val="FF0000"/>
+                <w:sz w:val="20"/>
+                <w:szCs w:val="20"/>
+              </w:rPr>
+            </w:pPr>
+            <w:r>
+              <w:rPr>
+                <w:i/>
+                <w:iCs/>
+                <w:color w:val="FF0000"/>
+                <w:sz w:val="20"/>
+                <w:szCs w:val="20"/>
+              </w:rPr>
+              <w:t>+ Số lênh cơ bản : 45</w:t>
+            </w:r>
+          </w:p>
+          <w:p>
+            <w:pPr>
+              <w:rPr>
+                <w:i/>
+                <w:iCs/>
+                <w:color w:val="FF0000"/>
+                <w:sz w:val="20"/>
+                <w:szCs w:val="20"/>
+              </w:rPr>
+            </w:pPr>
+            <w:r>
+              <w:rPr>
+                <w:i/>
+                <w:iCs/>
+                <w:color w:val="FF0000"/>
+                <w:sz w:val="20"/>
+                <w:szCs w:val="20"/>
+              </w:rPr>
+              <w:t>+ Nó sẽ bắt CPU phải thực thi nhiều hơn 1 lệnh cơ bản điều này làm N(x) tăng lên , gây lãng phí tài nguyên máy và giảm hiệu suất chương trình</w:t>
+            </w:r>
+          </w:p>
+          <w:p>
+            <w:pPr>
+              <w:rPr>
+                <w:color w:val="FF0000"/>
+              </w:rPr>
+            </w:pPr>
+            <w:r>
+              <w:rPr>
+                <w:i/>
+                <w:iCs/>
+                <w:color w:val="FF0000"/>
+                <w:sz w:val="20"/>
+                <w:szCs w:val="20"/>
+              </w:rPr>
+              <w:t>+Đem các lệnh khởi tạo và lệnh nạp địa chỉ mảng ra bên ngoài vòng lăp</w:t>
             </w:r>
           </w:p>
         </w:tc>
@@ -23444,6 +25199,7 @@
       <w:tr>
         <w:trPr>
           <w:cantSplit/>
+          <w:trHeight w:val="228"/>
           <w:tblHeader/>
         </w:trPr>
         <w:tc>
@@ -23546,10 +25302,13 @@
             </w:pPr>
             <w:r>
               <w:rPr>
-                <w:sz w:val="22"/>
-                <w:szCs w:val="22"/>
-              </w:rPr>
-              <w:t>☐</w:t>
+                <w:rFonts w:ascii="Segoe UI Symbol" w:hAnsi="Segoe UI Symbol" w:cs="Segoe UI Symbol"/>
+                <w:b/>
+                <w:bCs/>
+                <w:sz w:val="22"/>
+                <w:szCs w:val="22"/>
+              </w:rPr>
+              <w:t>☑</w:t>
             </w:r>
           </w:p>
         </w:tc>
@@ -23689,10 +25448,13 @@
             </w:pPr>
             <w:r>
               <w:rPr>
-                <w:sz w:val="22"/>
-                <w:szCs w:val="22"/>
-              </w:rPr>
-              <w:t>☐</w:t>
+                <w:rFonts w:ascii="Segoe UI Symbol" w:hAnsi="Segoe UI Symbol" w:cs="Segoe UI Symbol"/>
+                <w:b/>
+                <w:bCs/>
+                <w:sz w:val="22"/>
+                <w:szCs w:val="22"/>
+              </w:rPr>
+              <w:t>☑</w:t>
             </w:r>
           </w:p>
         </w:tc>
@@ -23787,10 +25549,11 @@
             </w:pPr>
             <w:r>
               <w:rPr>
-                <w:sz w:val="22"/>
-                <w:szCs w:val="22"/>
-              </w:rPr>
-              <w:t>☐</w:t>
+                <w:rFonts w:ascii="Segoe UI Symbol" w:hAnsi="Segoe UI Symbol" w:cs="Segoe UI Symbol"/>
+                <w:sz w:val="22"/>
+                <w:szCs w:val="22"/>
+              </w:rPr>
+              <w:t>☑</w:t>
             </w:r>
           </w:p>
         </w:tc>
@@ -23856,10 +25619,13 @@
             </w:pPr>
             <w:r>
               <w:rPr>
-                <w:sz w:val="22"/>
-                <w:szCs w:val="22"/>
-              </w:rPr>
-              <w:t>☐</w:t>
+                <w:rFonts w:ascii="Segoe UI Symbol" w:hAnsi="Segoe UI Symbol" w:cs="Segoe UI Symbol"/>
+                <w:b/>
+                <w:bCs/>
+                <w:sz w:val="22"/>
+                <w:szCs w:val="22"/>
+              </w:rPr>
+              <w:t>☑</w:t>
             </w:r>
           </w:p>
         </w:tc>
@@ -23924,10 +25690,13 @@
             </w:pPr>
             <w:r>
               <w:rPr>
-                <w:sz w:val="22"/>
-                <w:szCs w:val="22"/>
-              </w:rPr>
-              <w:t>☐</w:t>
+                <w:rFonts w:ascii="Segoe UI Symbol" w:hAnsi="Segoe UI Symbol" w:cs="Segoe UI Symbol"/>
+                <w:b/>
+                <w:bCs/>
+                <w:sz w:val="22"/>
+                <w:szCs w:val="22"/>
+              </w:rPr>
+              <w:t>☑</w:t>
             </w:r>
           </w:p>
         </w:tc>
@@ -24228,6 +25997,13 @@
                 <w:color w:val="FF0000"/>
               </w:rPr>
             </w:pPr>
+            <w:r>
+              <w:rPr>
+                <w:sz w:val="22"/>
+                <w:szCs w:val="22"/>
+              </w:rPr>
+              <w:t>1,5</w:t>
+            </w:r>
           </w:p>
         </w:tc>
       </w:tr>
@@ -24327,6 +26103,13 @@
                 <w:color w:val="FF0000"/>
               </w:rPr>
             </w:pPr>
+            <w:r>
+              <w:rPr>
+                <w:sz w:val="22"/>
+                <w:szCs w:val="22"/>
+              </w:rPr>
+              <w:t>4,0</w:t>
+            </w:r>
           </w:p>
         </w:tc>
       </w:tr>
@@ -24426,12 +26209,20 @@
                 <w:color w:val="FF0000"/>
               </w:rPr>
             </w:pPr>
+            <w:r>
+              <w:rPr>
+                <w:sz w:val="22"/>
+                <w:szCs w:val="22"/>
+              </w:rPr>
+              <w:t>2,0</w:t>
+            </w:r>
           </w:p>
         </w:tc>
       </w:tr>
       <w:tr>
         <w:trPr>
           <w:cantSplit/>
+          <w:trHeight w:val="174"/>
         </w:trPr>
         <w:tc>
           <w:tcPr>
@@ -24525,12 +26316,20 @@
                 <w:color w:val="FF0000"/>
               </w:rPr>
             </w:pPr>
+            <w:r>
+              <w:rPr>
+                <w:sz w:val="22"/>
+                <w:szCs w:val="22"/>
+              </w:rPr>
+              <w:t>2,0</w:t>
+            </w:r>
           </w:p>
         </w:tc>
       </w:tr>
       <w:tr>
         <w:trPr>
           <w:cantSplit/>
+          <w:trHeight w:val="165"/>
         </w:trPr>
         <w:tc>
           <w:tcPr>
@@ -24621,6 +26420,13 @@
                 <w:color w:val="FF0000"/>
               </w:rPr>
             </w:pPr>
+            <w:r>
+              <w:rPr>
+                <w:sz w:val="22"/>
+                <w:szCs w:val="22"/>
+              </w:rPr>
+              <w:t>0,5</w:t>
+            </w:r>
           </w:p>
         </w:tc>
       </w:tr>
@@ -24706,18 +26512,116 @@
           <w:p>
             <w:pPr>
               <w:rPr>
-                <w:color w:val="FF0000"/>
-              </w:rPr>
-            </w:pPr>
-            <w:r>
-              <w:rPr>
                 <w:i/>
                 <w:iCs/>
                 <w:color w:val="FF0000"/>
                 <w:sz w:val="20"/>
                 <w:szCs w:val="20"/>
               </w:rPr>
+            </w:pPr>
+            <w:r>
+              <w:rPr>
+                <w:i/>
+                <w:iCs/>
+                <w:color w:val="FF0000"/>
+                <w:sz w:val="20"/>
+                <w:szCs w:val="20"/>
+              </w:rPr>
               <w:t>Trả lời:</w:t>
+            </w:r>
+            <w:r>
+              <w:rPr>
+                <w:i/>
+                <w:iCs/>
+                <w:color w:val="FF0000"/>
+                <w:sz w:val="20"/>
+                <w:szCs w:val="20"/>
+              </w:rPr>
+              <w:t xml:space="preserve"> số dòng nguồn là số dòng code do người lập trình viết ra (bao gồm cả lệnh giả ). Số lệnh trong bộ nhớ là số lệnh máy cơ bản thực sự được nạp vào bộ nhớ . Còn số lệnh thực thi là số lệnh thực sự được chạy bởi CPU </w:t>
+            </w:r>
+          </w:p>
+          <w:p>
+            <w:pPr>
+              <w:rPr>
+                <w:i/>
+                <w:iCs/>
+                <w:color w:val="FF0000"/>
+                <w:sz w:val="20"/>
+                <w:szCs w:val="20"/>
+              </w:rPr>
+            </w:pPr>
+            <w:r>
+              <w:rPr>
+                <w:i/>
+                <w:iCs/>
+                <w:color w:val="FF0000"/>
+                <w:sz w:val="20"/>
+                <w:szCs w:val="20"/>
+              </w:rPr>
+              <w:t>Các tình huống cần quan tầm :</w:t>
+            </w:r>
+          </w:p>
+          <w:p>
+            <w:pPr>
+              <w:rPr>
+                <w:i/>
+                <w:iCs/>
+                <w:color w:val="FF0000"/>
+                <w:sz w:val="20"/>
+                <w:szCs w:val="20"/>
+              </w:rPr>
+            </w:pPr>
+            <w:r>
+              <w:rPr>
+                <w:i/>
+                <w:iCs/>
+                <w:color w:val="FF0000"/>
+                <w:sz w:val="20"/>
+                <w:szCs w:val="20"/>
+              </w:rPr>
+              <w:t>+ Đối với số dòng nguồn : quan tâm khi cần đánh giá khối lượng công việc, tính toán số dòng code hoạc tối ưu mã nguồn,…</w:t>
+            </w:r>
+          </w:p>
+          <w:p>
+            <w:pPr>
+              <w:rPr>
+                <w:i/>
+                <w:iCs/>
+                <w:color w:val="FF0000"/>
+                <w:sz w:val="20"/>
+                <w:szCs w:val="20"/>
+              </w:rPr>
+            </w:pPr>
+            <w:r>
+              <w:rPr>
+                <w:i/>
+                <w:iCs/>
+                <w:color w:val="FF0000"/>
+                <w:sz w:val="20"/>
+                <w:szCs w:val="20"/>
+              </w:rPr>
+              <w:t>+Số lệnh trong bộ nhớ : quan tâm khi thiết kế các hệ thống nhúng , vi điều khiển có bộ nhớ hẹp, nên cần tối ưu để code nhẹ nhất có thể,..</w:t>
+            </w:r>
+          </w:p>
+          <w:p>
+            <w:pPr>
+              <w:rPr>
+                <w:i/>
+                <w:iCs/>
+                <w:color w:val="FF0000"/>
+                <w:sz w:val="20"/>
+                <w:szCs w:val="20"/>
+              </w:rPr>
+            </w:pPr>
+            <w:r>
+              <w:rPr>
+                <w:i/>
+                <w:iCs/>
+                <w:color w:val="FF0000"/>
+                <w:sz w:val="20"/>
+                <w:szCs w:val="20"/>
+              </w:rPr>
+              <w:t>+ Số lệnh thực thi : quan tâm mkhi cần tối ưu hóa điện năng, tăng tốc độ chương trình , tiết kiệm điện ,…</w:t>
             </w:r>
           </w:p>
         </w:tc>
@@ -24790,18 +26694,83 @@
           <w:p>
             <w:pPr>
               <w:rPr>
-                <w:color w:val="FF0000"/>
-              </w:rPr>
-            </w:pPr>
-            <w:r>
-              <w:rPr>
                 <w:i/>
                 <w:iCs/>
                 <w:color w:val="FF0000"/>
                 <w:sz w:val="20"/>
                 <w:szCs w:val="20"/>
               </w:rPr>
+            </w:pPr>
+            <w:r>
+              <w:rPr>
+                <w:i/>
+                <w:iCs/>
+                <w:color w:val="FF0000"/>
+                <w:sz w:val="20"/>
+                <w:szCs w:val="20"/>
+              </w:rPr>
               <w:t>Trả lời:</w:t>
+            </w:r>
+            <w:r>
+              <w:rPr>
+                <w:i/>
+                <w:iCs/>
+                <w:color w:val="FF0000"/>
+                <w:sz w:val="20"/>
+                <w:szCs w:val="20"/>
+              </w:rPr>
+              <w:t xml:space="preserve"> Quyết định các CPU diễn giải bit dấu của thanh ghi 32-bit. So sánh có dấu thì coi MSB = 1 là só âm trong khi so sánh không dấu thì bỏ qua điều đó .</w:t>
+            </w:r>
+          </w:p>
+          <w:p>
+            <w:pPr>
+              <w:rPr>
+                <w:i/>
+                <w:iCs/>
+                <w:color w:val="FF0000"/>
+                <w:sz w:val="20"/>
+                <w:szCs w:val="20"/>
+              </w:rPr>
+            </w:pPr>
+            <w:r>
+              <w:rPr>
+                <w:i/>
+                <w:iCs/>
+                <w:color w:val="FF0000"/>
+                <w:sz w:val="20"/>
+                <w:szCs w:val="20"/>
+              </w:rPr>
+              <w:t>Tình huống : k</w:t>
+            </w:r>
+            <w:r>
+              <w:rPr>
+                <w:i/>
+                <w:iCs/>
+                <w:color w:val="FF0000"/>
+                <w:sz w:val="20"/>
+                <w:szCs w:val="20"/>
+              </w:rPr>
+              <w:t xml:space="preserve">hi thao tác và so sánh các địa chỉ bộ nhớ (Con trỏ). Địa chỉ bộ nhớ MIPS là các số không dấu và có thể vươn tới vùng không gian hệ thống rất cao (bắt đầu bằng bit 1, ví dụ 0x80000000). Nếu dùng so sánh có dấu (slt), địa chỉ cao này sẽ bị hiểu lầm là một "số âm" rất nhỏ, dẫn đến các phép tính ranh giới bộ nhớ, cấp phát động, hoặc so sánh hai con trỏ bị sai bét </w:t>
+            </w:r>
+            <w:r>
+              <w:rPr>
+                <w:i/>
+                <w:iCs/>
+                <w:color w:val="FF0000"/>
+                <w:sz w:val="20"/>
+                <w:szCs w:val="20"/>
+              </w:rPr>
+              <w:t xml:space="preserve">. </w:t>
+            </w:r>
+            <w:r>
+              <w:rPr>
+                <w:i/>
+                <w:iCs/>
+                <w:color w:val="FF0000"/>
+                <w:sz w:val="20"/>
+                <w:szCs w:val="20"/>
+              </w:rPr>
+              <w:t>Do đó, thao tác với địa chỉ bắt buộc phải dùng lệnh rẽ nhánh/so sánh không dấu</w:t>
             </w:r>
           </w:p>
         </w:tc>
@@ -24822,6 +26791,7 @@
           <w:b/>
           <w:bCs/>
         </w:rPr>
+        <w:lastRenderedPageBreak/>
         <w:t>Câu R3 (Đánh giá).</w:t>
       </w:r>
       <w:r>
@@ -24874,18 +26844,100 @@
           <w:p>
             <w:pPr>
               <w:rPr>
-                <w:color w:val="FF0000"/>
-              </w:rPr>
-            </w:pPr>
-            <w:r>
-              <w:rPr>
                 <w:i/>
                 <w:iCs/>
                 <w:color w:val="FF0000"/>
                 <w:sz w:val="20"/>
                 <w:szCs w:val="20"/>
               </w:rPr>
+            </w:pPr>
+            <w:r>
+              <w:rPr>
+                <w:i/>
+                <w:iCs/>
+                <w:color w:val="FF0000"/>
+                <w:sz w:val="20"/>
+                <w:szCs w:val="20"/>
+              </w:rPr>
               <w:t>Trả lời:</w:t>
+            </w:r>
+            <w:r>
+              <w:rPr>
+                <w:i/>
+                <w:iCs/>
+                <w:color w:val="FF0000"/>
+                <w:sz w:val="20"/>
+                <w:szCs w:val="20"/>
+              </w:rPr>
+              <w:t xml:space="preserve"> Dạ trong TN3 , trong lúc khai báo phần tử cho mảng cao độ và độ  dài thì ở mảng độ dài em đã khai báo thiếu một dòng phần tử trong khi mảng cao độ vẫn đủ số note. Điều này khiến 2 mảng không đồng bộ về mặt kích thước </w:t>
+            </w:r>
+          </w:p>
+          <w:p>
+            <w:pPr>
+              <w:rPr>
+                <w:i/>
+                <w:iCs/>
+                <w:color w:val="FF0000"/>
+                <w:sz w:val="20"/>
+                <w:szCs w:val="20"/>
+              </w:rPr>
+            </w:pPr>
+            <w:r>
+              <w:rPr>
+                <w:i/>
+                <w:iCs/>
+                <w:color w:val="FF0000"/>
+                <w:sz w:val="20"/>
+                <w:szCs w:val="20"/>
+              </w:rPr>
+              <w:t>Em đã phát hiện ra khi chạy chương trình có một đoạn âm thanh vang lên rất lạ và bị kéo dài , instruction counter cũng sai . Nên khi check lại em đã phát hiện lỗi</w:t>
+            </w:r>
+          </w:p>
+          <w:p>
+            <w:pPr>
+              <w:rPr>
+                <w:color w:val="FF0000"/>
+              </w:rPr>
+            </w:pPr>
+            <w:r>
+              <w:rPr>
+                <w:i/>
+                <w:iCs/>
+                <w:color w:val="FF0000"/>
+                <w:sz w:val="20"/>
+                <w:szCs w:val="20"/>
+              </w:rPr>
+              <w:t xml:space="preserve">Bài học: với ngôn ngữ bậc cao như C++ nếu khai báo sai thì nó sẽ cảnh báo tràn mảng . Nhưng với </w:t>
+            </w:r>
+            <w:r>
+              <w:rPr>
+                <w:i/>
+                <w:iCs/>
+                <w:color w:val="FF0000"/>
+                <w:sz w:val="20"/>
+                <w:szCs w:val="20"/>
+              </w:rPr>
+              <w:t>ngôn</w:t>
+            </w:r>
+            <w:r>
+              <w:rPr>
+                <w:i/>
+                <w:iCs/>
+                <w:color w:val="FF0000"/>
+                <w:sz w:val="20"/>
+                <w:szCs w:val="20"/>
+              </w:rPr>
+              <w:t xml:space="preserve"> ngữ MIPS Assembly thì </w:t>
+            </w:r>
+            <w:r>
+              <w:rPr>
+                <w:i/>
+                <w:iCs/>
+                <w:color w:val="FF0000"/>
+                <w:sz w:val="20"/>
+                <w:szCs w:val="20"/>
+              </w:rPr>
+              <w:t>chương trình sẽ duyệt tới khi hết vòng lặp bất chấp dữ liệu đó là rác hay không . Vì vậy khi lập trình ngôn ngữ máy thì em cần phái kĩ càng trong việc cấp phát, quản lý mảng và các con trỏ.</w:t>
             </w:r>
           </w:p>
         </w:tc>
@@ -24937,12 +26989,12 @@
       </w:r>
     </w:p>
     <w:sectPr>
-      <w:headerReference w:type="even" r:id="rId9"/>
-      <w:headerReference w:type="default" r:id="rId10"/>
-      <w:footerReference w:type="even" r:id="rId11"/>
-      <w:footerReference w:type="default" r:id="rId12"/>
-      <w:headerReference w:type="first" r:id="rId13"/>
-      <w:footerReference w:type="first" r:id="rId14"/>
+      <w:headerReference w:type="even" r:id="rId10"/>
+      <w:headerReference w:type="default" r:id="rId11"/>
+      <w:footerReference w:type="even" r:id="rId12"/>
+      <w:footerReference w:type="default" r:id="rId13"/>
+      <w:headerReference w:type="first" r:id="rId14"/>
+      <w:footerReference w:type="first" r:id="rId15"/>
       <w:pgSz w:w="11906" w:h="16838"/>
       <w:pgMar w:top="1134" w:right="1134" w:bottom="1134" w:left="1134" w:header="500" w:footer="500" w:gutter="0"/>
       <w:cols w:space="720"/>
@@ -25216,6 +27268,118 @@
     </w:lvl>
   </w:abstractNum>
   <w:abstractNum w:abstractNumId="1" w15:restartNumberingAfterBreak="0">
+    <w:nsid w:val="4F930868"/>
+    <w:multiLevelType w:val="hybridMultilevel"/>
+    <w:tmpl w:val="CDC6BB18"/>
+    <w:lvl w:ilvl="0" w:tplc="568EFE70">
+      <w:numFmt w:val="bullet"/>
+      <w:lvlText w:val=""/>
+      <w:lvlJc w:val="left"/>
+      <w:pPr>
+        <w:ind w:left="720" w:hanging="360"/>
+      </w:pPr>
+      <w:rPr>
+        <w:rFonts w:ascii="Wingdings" w:eastAsia="Times New Roman" w:hAnsi="Wingdings" w:cs="Times New Roman" w:hint="default"/>
+      </w:rPr>
+    </w:lvl>
+    <w:lvl w:ilvl="1" w:tplc="04090003" w:tentative="1">
+      <w:start w:val="1"/>
+      <w:numFmt w:val="bullet"/>
+      <w:lvlText w:val="o"/>
+      <w:lvlJc w:val="left"/>
+      <w:pPr>
+        <w:ind w:left="1440" w:hanging="360"/>
+      </w:pPr>
+      <w:rPr>
+        <w:rFonts w:ascii="Courier New" w:hAnsi="Courier New" w:cs="Courier New" w:hint="default"/>
+      </w:rPr>
+    </w:lvl>
+    <w:lvl w:ilvl="2" w:tplc="04090005" w:tentative="1">
+      <w:start w:val="1"/>
+      <w:numFmt w:val="bullet"/>
+      <w:lvlText w:val=""/>
+      <w:lvlJc w:val="left"/>
+      <w:pPr>
+        <w:ind w:left="2160" w:hanging="360"/>
+      </w:pPr>
+      <w:rPr>
+        <w:rFonts w:ascii="Wingdings" w:hAnsi="Wingdings" w:hint="default"/>
+      </w:rPr>
+    </w:lvl>
+    <w:lvl w:ilvl="3" w:tplc="04090001" w:tentative="1">
+      <w:start w:val="1"/>
+      <w:numFmt w:val="bullet"/>
+      <w:lvlText w:val=""/>
+      <w:lvlJc w:val="left"/>
+      <w:pPr>
+        <w:ind w:left="2880" w:hanging="360"/>
+      </w:pPr>
+      <w:rPr>
+        <w:rFonts w:ascii="Symbol" w:hAnsi="Symbol" w:hint="default"/>
+      </w:rPr>
+    </w:lvl>
+    <w:lvl w:ilvl="4" w:tplc="04090003" w:tentative="1">
+      <w:start w:val="1"/>
+      <w:numFmt w:val="bullet"/>
+      <w:lvlText w:val="o"/>
+      <w:lvlJc w:val="left"/>
+      <w:pPr>
+        <w:ind w:left="3600" w:hanging="360"/>
+      </w:pPr>
+      <w:rPr>
+        <w:rFonts w:ascii="Courier New" w:hAnsi="Courier New" w:cs="Courier New" w:hint="default"/>
+      </w:rPr>
+    </w:lvl>
+    <w:lvl w:ilvl="5" w:tplc="04090005" w:tentative="1">
+      <w:start w:val="1"/>
+      <w:numFmt w:val="bullet"/>
+      <w:lvlText w:val=""/>
+      <w:lvlJc w:val="left"/>
+      <w:pPr>
+        <w:ind w:left="4320" w:hanging="360"/>
+      </w:pPr>
+      <w:rPr>
+        <w:rFonts w:ascii="Wingdings" w:hAnsi="Wingdings" w:hint="default"/>
+      </w:rPr>
+    </w:lvl>
+    <w:lvl w:ilvl="6" w:tplc="04090001" w:tentative="1">
+      <w:start w:val="1"/>
+      <w:numFmt w:val="bullet"/>
+      <w:lvlText w:val=""/>
+      <w:lvlJc w:val="left"/>
+      <w:pPr>
+        <w:ind w:left="5040" w:hanging="360"/>
+      </w:pPr>
+      <w:rPr>
+        <w:rFonts w:ascii="Symbol" w:hAnsi="Symbol" w:hint="default"/>
+      </w:rPr>
+    </w:lvl>
+    <w:lvl w:ilvl="7" w:tplc="04090003" w:tentative="1">
+      <w:start w:val="1"/>
+      <w:numFmt w:val="bullet"/>
+      <w:lvlText w:val="o"/>
+      <w:lvlJc w:val="left"/>
+      <w:pPr>
+        <w:ind w:left="5760" w:hanging="360"/>
+      </w:pPr>
+      <w:rPr>
+        <w:rFonts w:ascii="Courier New" w:hAnsi="Courier New" w:cs="Courier New" w:hint="default"/>
+      </w:rPr>
+    </w:lvl>
+    <w:lvl w:ilvl="8" w:tplc="04090005" w:tentative="1">
+      <w:start w:val="1"/>
+      <w:numFmt w:val="bullet"/>
+      <w:lvlText w:val=""/>
+      <w:lvlJc w:val="left"/>
+      <w:pPr>
+        <w:ind w:left="6480" w:hanging="360"/>
+      </w:pPr>
+      <w:rPr>
+        <w:rFonts w:ascii="Wingdings" w:hAnsi="Wingdings" w:hint="default"/>
+      </w:rPr>
+    </w:lvl>
+  </w:abstractNum>
+  <w:abstractNum w:abstractNumId="2" w15:restartNumberingAfterBreak="0">
     <w:nsid w:val="62925115"/>
     <w:multiLevelType w:val="hybridMultilevel"/>
     <w:tmpl w:val="E8709CB0"/>
@@ -25327,7 +27491,7 @@
       </w:rPr>
     </w:lvl>
   </w:abstractNum>
-  <w:abstractNum w:abstractNumId="2" w15:restartNumberingAfterBreak="0">
+  <w:abstractNum w:abstractNumId="3" w15:restartNumberingAfterBreak="0">
     <w:nsid w:val="78227168"/>
     <w:multiLevelType w:val="hybridMultilevel"/>
     <w:tmpl w:val="073AA342"/>
@@ -25413,7 +27577,7 @@
       </w:pPr>
     </w:lvl>
   </w:abstractNum>
-  <w:abstractNum w:abstractNumId="3" w15:restartNumberingAfterBreak="0">
+  <w:abstractNum w:abstractNumId="4" w15:restartNumberingAfterBreak="0">
     <w:nsid w:val="789C4EF0"/>
     <w:multiLevelType w:val="hybridMultilevel"/>
     <w:tmpl w:val="2E861E48"/>
@@ -25468,7 +27632,7 @@
     </w:lvl>
   </w:abstractNum>
   <w:num w:numId="1" w16cid:durableId="209655397">
-    <w:abstractNumId w:val="2"/>
+    <w:abstractNumId w:val="3"/>
     <w:lvlOverride w:ilvl="0">
       <w:startOverride w:val="1"/>
     </w:lvlOverride>
@@ -25480,12 +27644,15 @@
     </w:lvlOverride>
   </w:num>
   <w:num w:numId="3" w16cid:durableId="1344934052">
-    <w:abstractNumId w:val="3"/>
+    <w:abstractNumId w:val="4"/>
     <w:lvlOverride w:ilvl="0">
       <w:startOverride w:val="1"/>
     </w:lvlOverride>
   </w:num>
   <w:num w:numId="4" w16cid:durableId="2137789437">
+    <w:abstractNumId w:val="2"/>
+  </w:num>
+  <w:num w:numId="5" w16cid:durableId="2001887459">
     <w:abstractNumId w:val="1"/>
   </w:num>
 </w:numbering>

</xml_diff>